<commit_message>
14062026-Update spec, docs, and exports for data engine and website; add editorial-sources and polish plan
Co-Authored-By: Claude Opus 4.8 (1M context) <noreply@anthropic.com>
</commit_message>
<xml_diff>
--- a/docs/exports/02-DATABASE.docx
+++ b/docs/exports/02-DATABASE.docx
@@ -10,7 +10,7 @@
         <w:t xml:space="preserve">02-DATABASE</w:t>
       </w:r>
     </w:p>
-    <w:bookmarkStart w:id="19" w:name="database"/>
+    <w:bookmarkStart w:id="20" w:name="database"/>
     <w:p>
       <w:pPr>
         <w:pStyle w:val="Heading1"/>
@@ -115,7 +115,7 @@
       </w:r>
     </w:p>
     <w:bookmarkEnd w:id="9"/>
-    <w:bookmarkStart w:id="15" w:name="tables"/>
+    <w:bookmarkStart w:id="16" w:name="tables"/>
     <w:p>
       <w:pPr>
         <w:pStyle w:val="Heading2"/>
@@ -482,7 +482,45 @@
               <w:pStyle w:val="Compact"/>
             </w:pPr>
             <w:r>
-              <w:t xml:space="preserve">short extract (no full-text copyright issues)</w:t>
+              <w:t xml:space="preserve">short derived summary; full body is fetched + analyzed ephemerally, never stored (D-013)</w:t>
+            </w:r>
+          </w:p>
+        </w:tc>
+      </w:tr>
+      <w:tr>
+        <w:tc>
+          <w:tcPr/>
+          <w:p>
+            <w:pPr>
+              <w:pStyle w:val="Compact"/>
+            </w:pPr>
+            <w:r>
+              <w:rPr>
+                <w:rStyle w:val="VerbatimChar"/>
+              </w:rPr>
+              <w:t xml:space="preserve">author</w:t>
+            </w:r>
+          </w:p>
+        </w:tc>
+        <w:tc>
+          <w:tcPr/>
+          <w:p>
+            <w:pPr>
+              <w:pStyle w:val="Compact"/>
+            </w:pPr>
+            <w:r>
+              <w:t xml:space="preserve">text null</w:t>
+            </w:r>
+          </w:p>
+        </w:tc>
+        <w:tc>
+          <w:tcPr/>
+          <w:p>
+            <w:pPr>
+              <w:pStyle w:val="Compact"/>
+            </w:pPr>
+            <w:r>
+              <w:t xml:space="preserve">byline when present; enables future author-level reputation (D-014)</w:t>
             </w:r>
           </w:p>
         </w:tc>
@@ -733,11 +771,33 @@
         <w:t xml:space="preserve"> </w:t>
       </w:r>
       <w:r>
-        <w:t xml:space="preserve">DB lean. The original is always linked.</w:t>
+        <w:t xml:space="preserve">DB lean. The original is always linked. The crew fetches the full body</w:t>
+      </w:r>
+      <w:r>
+        <w:t xml:space="preserve"> </w:t>
+      </w:r>
+      <w:r>
+        <w:rPr>
+          <w:i/>
+          <w:iCs/>
+        </w:rPr>
+        <w:t xml:space="preserve">ephemerally</w:t>
+      </w:r>
+      <w:r>
+        <w:t xml:space="preserve"> </w:t>
+      </w:r>
+      <w:r>
+        <w:t xml:space="preserve">at</w:t>
+      </w:r>
+      <w:r>
+        <w:t xml:space="preserve"> </w:t>
+      </w:r>
+      <w:r>
+        <w:t xml:space="preserve">analysis time (D-013); it is never persisted.</w:t>
       </w:r>
     </w:p>
     <w:bookmarkEnd w:id="10"/>
-    <w:bookmarkStart w:id="11" w:name="stories-one-per-clustered-topic"/>
+    <w:bookmarkStart w:id="11" w:name="sources-outlet-reputation-memory-d-014"/>
     <w:p>
       <w:pPr>
         <w:pStyle w:val="Heading3"/>
@@ -746,921 +806,13 @@
         <w:rPr>
           <w:rStyle w:val="VerbatimChar"/>
         </w:rPr>
-        <w:t xml:space="preserve">stories</w:t>
-      </w:r>
-      <w:r>
-        <w:t xml:space="preserve"> </w:t>
-      </w:r>
-      <w:r>
-        <w:t xml:space="preserve">— one per clustered topic</w:t>
-      </w:r>
-    </w:p>
-    <w:tbl>
-      <w:tblPr>
-        <w:tblStyle w:val="Table"/>
-        <w:tblW w:type="auto" w:w="0"/>
-        <w:tblLook w:firstRow="1" w:lastRow="0" w:firstColumn="0" w:lastColumn="0" w:noHBand="0" w:noVBand="0" w:val="0020"/>
-      </w:tblPr>
-      <w:tblGrid>
-        <w:gridCol w:w="2640"/>
-        <w:gridCol w:w="2640"/>
-        <w:gridCol w:w="2640"/>
-      </w:tblGrid>
-      <w:tr>
-        <w:trPr>
-          <w:tblHeader w:val="on"/>
-        </w:trPr>
-        <w:tc>
-          <w:tcPr/>
-          <w:p>
-            <w:pPr>
-              <w:pStyle w:val="Compact"/>
-            </w:pPr>
-            <w:r>
-              <w:t xml:space="preserve">Column</w:t>
-            </w:r>
-          </w:p>
-        </w:tc>
-        <w:tc>
-          <w:tcPr/>
-          <w:p>
-            <w:pPr>
-              <w:pStyle w:val="Compact"/>
-            </w:pPr>
-            <w:r>
-              <w:t xml:space="preserve">Type</w:t>
-            </w:r>
-          </w:p>
-        </w:tc>
-        <w:tc>
-          <w:tcPr/>
-          <w:p>
-            <w:pPr>
-              <w:pStyle w:val="Compact"/>
-            </w:pPr>
-            <w:r>
-              <w:t xml:space="preserve">Notes</w:t>
-            </w:r>
-          </w:p>
-        </w:tc>
-      </w:tr>
-      <w:tr>
-        <w:tc>
-          <w:tcPr/>
-          <w:p>
-            <w:pPr>
-              <w:pStyle w:val="Compact"/>
-            </w:pPr>
-            <w:r>
-              <w:rPr>
-                <w:rStyle w:val="VerbatimChar"/>
-              </w:rPr>
-              <w:t xml:space="preserve">id</w:t>
-            </w:r>
-          </w:p>
-        </w:tc>
-        <w:tc>
-          <w:tcPr/>
-          <w:p>
-            <w:pPr>
-              <w:pStyle w:val="Compact"/>
-            </w:pPr>
-            <w:r>
-              <w:t xml:space="preserve">uuid PK</w:t>
-            </w:r>
-          </w:p>
-        </w:tc>
-        <w:tc>
-          <w:tcPr/>
-          <w:p>
-            <w:pPr>
-              <w:pStyle w:val="Compact"/>
-            </w:pPr>
-          </w:p>
-        </w:tc>
-      </w:tr>
-      <w:tr>
-        <w:tc>
-          <w:tcPr/>
-          <w:p>
-            <w:pPr>
-              <w:pStyle w:val="Compact"/>
-            </w:pPr>
-            <w:r>
-              <w:rPr>
-                <w:rStyle w:val="VerbatimChar"/>
-              </w:rPr>
-              <w:t xml:space="preserve">topic</w:t>
-            </w:r>
-          </w:p>
-        </w:tc>
-        <w:tc>
-          <w:tcPr/>
-          <w:p>
-            <w:pPr>
-              <w:pStyle w:val="Compact"/>
-            </w:pPr>
-            <w:r>
-              <w:t xml:space="preserve">text</w:t>
-            </w:r>
-          </w:p>
-        </w:tc>
-        <w:tc>
-          <w:tcPr/>
-          <w:p>
-            <w:pPr>
-              <w:pStyle w:val="Compact"/>
-            </w:pPr>
-            <w:r>
-              <w:t xml:space="preserve">short canonical title for the event</w:t>
-            </w:r>
-          </w:p>
-        </w:tc>
-      </w:tr>
-      <w:tr>
-        <w:tc>
-          <w:tcPr/>
-          <w:p>
-            <w:pPr>
-              <w:pStyle w:val="Compact"/>
-            </w:pPr>
-            <w:r>
-              <w:rPr>
-                <w:rStyle w:val="VerbatimChar"/>
-              </w:rPr>
-              <w:t xml:space="preserve">first_seen</w:t>
-            </w:r>
-          </w:p>
-        </w:tc>
-        <w:tc>
-          <w:tcPr/>
-          <w:p>
-            <w:pPr>
-              <w:pStyle w:val="Compact"/>
-            </w:pPr>
-            <w:r>
-              <w:t xml:space="preserve">timestamptz</w:t>
-            </w:r>
-          </w:p>
-        </w:tc>
-        <w:tc>
-          <w:tcPr/>
-          <w:p>
-            <w:pPr>
-              <w:pStyle w:val="Compact"/>
-            </w:pPr>
-          </w:p>
-        </w:tc>
-      </w:tr>
-      <w:tr>
-        <w:tc>
-          <w:tcPr/>
-          <w:p>
-            <w:pPr>
-              <w:pStyle w:val="Compact"/>
-            </w:pPr>
-            <w:r>
-              <w:rPr>
-                <w:rStyle w:val="VerbatimChar"/>
-              </w:rPr>
-              <w:t xml:space="preserve">source_count</w:t>
-            </w:r>
-          </w:p>
-        </w:tc>
-        <w:tc>
-          <w:tcPr/>
-          <w:p>
-            <w:pPr>
-              <w:pStyle w:val="Compact"/>
-            </w:pPr>
-            <w:r>
-              <w:t xml:space="preserve">int</w:t>
-            </w:r>
-          </w:p>
-        </w:tc>
-        <w:tc>
-          <w:tcPr/>
-          <w:p>
-            <w:pPr>
-              <w:pStyle w:val="Compact"/>
-            </w:pPr>
-            <w:r>
-              <w:t xml:space="preserve">number of articles in the cluster</w:t>
-            </w:r>
-          </w:p>
-        </w:tc>
-      </w:tr>
-      <w:tr>
-        <w:tc>
-          <w:tcPr/>
-          <w:p>
-            <w:pPr>
-              <w:pStyle w:val="Compact"/>
-            </w:pPr>
-            <w:r>
-              <w:rPr>
-                <w:rStyle w:val="VerbatimChar"/>
-              </w:rPr>
-              <w:t xml:space="preserve">lean_spread</w:t>
-            </w:r>
-          </w:p>
-        </w:tc>
-        <w:tc>
-          <w:tcPr/>
-          <w:p>
-            <w:pPr>
-              <w:pStyle w:val="Compact"/>
-            </w:pPr>
-            <w:r>
-              <w:t xml:space="preserve">jsonb</w:t>
-            </w:r>
-          </w:p>
-        </w:tc>
-        <w:tc>
-          <w:tcPr/>
-          <w:p>
-            <w:pPr>
-              <w:pStyle w:val="Compact"/>
-            </w:pPr>
-            <w:r>
-              <w:t xml:space="preserve">e.g. </w:t>
-            </w:r>
-            <w:r>
-              <w:rPr>
-                <w:rStyle w:val="VerbatimChar"/>
-              </w:rPr>
-              <w:t xml:space="preserve">{"left":5,"center":6,"right":3}</w:t>
-            </w:r>
-          </w:p>
-        </w:tc>
-      </w:tr>
-      <w:tr>
-        <w:tc>
-          <w:tcPr/>
-          <w:p>
-            <w:pPr>
-              <w:pStyle w:val="Compact"/>
-            </w:pPr>
-            <w:r>
-              <w:rPr>
-                <w:rStyle w:val="VerbatimChar"/>
-              </w:rPr>
-              <w:t xml:space="preserve">neutral_md</w:t>
-            </w:r>
-          </w:p>
-        </w:tc>
-        <w:tc>
-          <w:tcPr/>
-          <w:p>
-            <w:pPr>
-              <w:pStyle w:val="Compact"/>
-            </w:pPr>
-            <w:r>
-              <w:t xml:space="preserve">text</w:t>
-            </w:r>
-          </w:p>
-        </w:tc>
-        <w:tc>
-          <w:tcPr/>
-          <w:p>
-            <w:pPr>
-              <w:pStyle w:val="Compact"/>
-            </w:pPr>
-            <w:r>
-              <w:t xml:space="preserve">AI-neutral synthesis (markdown)</w:t>
-            </w:r>
-          </w:p>
-        </w:tc>
-      </w:tr>
-      <w:tr>
-        <w:tc>
-          <w:tcPr/>
-          <w:p>
-            <w:pPr>
-              <w:pStyle w:val="Compact"/>
-            </w:pPr>
-            <w:r>
-              <w:rPr>
-                <w:rStyle w:val="VerbatimChar"/>
-              </w:rPr>
-              <w:t xml:space="preserve">beginner_md</w:t>
-            </w:r>
-          </w:p>
-        </w:tc>
-        <w:tc>
-          <w:tcPr/>
-          <w:p>
-            <w:pPr>
-              <w:pStyle w:val="Compact"/>
-            </w:pPr>
-            <w:r>
-              <w:t xml:space="preserve">text</w:t>
-            </w:r>
-          </w:p>
-        </w:tc>
-        <w:tc>
-          <w:tcPr/>
-          <w:p>
-            <w:pPr>
-              <w:pStyle w:val="Compact"/>
-            </w:pPr>
-            <w:r>
-              <w:t xml:space="preserve">“what this means for you”</w:t>
-            </w:r>
-          </w:p>
-        </w:tc>
-      </w:tr>
-      <w:tr>
-        <w:tc>
-          <w:tcPr/>
-          <w:p>
-            <w:pPr>
-              <w:pStyle w:val="Compact"/>
-            </w:pPr>
-            <w:r>
-              <w:rPr>
-                <w:rStyle w:val="VerbatimChar"/>
-              </w:rPr>
-              <w:t xml:space="preserve">pro_md</w:t>
-            </w:r>
-          </w:p>
-        </w:tc>
-        <w:tc>
-          <w:tcPr/>
-          <w:p>
-            <w:pPr>
-              <w:pStyle w:val="Compact"/>
-            </w:pPr>
-            <w:r>
-              <w:t xml:space="preserve">text</w:t>
-            </w:r>
-          </w:p>
-        </w:tc>
-        <w:tc>
-          <w:tcPr/>
-          <w:p>
-            <w:pPr>
-              <w:pStyle w:val="Compact"/>
-            </w:pPr>
-            <w:r>
-              <w:t xml:space="preserve">game theory + market impact</w:t>
-            </w:r>
-          </w:p>
-        </w:tc>
-      </w:tr>
-      <w:tr>
-        <w:tc>
-          <w:tcPr/>
-          <w:p>
-            <w:pPr>
-              <w:pStyle w:val="Compact"/>
-            </w:pPr>
-            <w:r>
-              <w:rPr>
-                <w:rStyle w:val="VerbatimChar"/>
-              </w:rPr>
-              <w:t xml:space="preserve">sentiment</w:t>
-            </w:r>
-          </w:p>
-        </w:tc>
-        <w:tc>
-          <w:tcPr/>
-          <w:p>
-            <w:pPr>
-              <w:pStyle w:val="Compact"/>
-            </w:pPr>
-            <w:r>
-              <w:t xml:space="preserve">text</w:t>
-            </w:r>
-          </w:p>
-        </w:tc>
-        <w:tc>
-          <w:tcPr/>
-          <w:p>
-            <w:pPr>
-              <w:pStyle w:val="Compact"/>
-            </w:pPr>
-            <w:r>
-              <w:rPr>
-                <w:rStyle w:val="VerbatimChar"/>
-              </w:rPr>
-              <w:t xml:space="preserve">bullish</w:t>
-            </w:r>
-            <w:r>
-              <w:t xml:space="preserve"> </w:t>
-            </w:r>
-            <w:r>
-              <w:t xml:space="preserve">/</w:t>
-            </w:r>
-            <w:r>
-              <w:t xml:space="preserve"> </w:t>
-            </w:r>
-            <w:r>
-              <w:rPr>
-                <w:rStyle w:val="VerbatimChar"/>
-              </w:rPr>
-              <w:t xml:space="preserve">neutral</w:t>
-            </w:r>
-            <w:r>
-              <w:t xml:space="preserve"> </w:t>
-            </w:r>
-            <w:r>
-              <w:t xml:space="preserve">/</w:t>
-            </w:r>
-            <w:r>
-              <w:t xml:space="preserve"> </w:t>
-            </w:r>
-            <w:r>
-              <w:rPr>
-                <w:rStyle w:val="VerbatimChar"/>
-              </w:rPr>
-              <w:t xml:space="preserve">bearish</w:t>
-            </w:r>
-          </w:p>
-        </w:tc>
-      </w:tr>
-      <w:tr>
-        <w:tc>
-          <w:tcPr/>
-          <w:p>
-            <w:pPr>
-              <w:pStyle w:val="Compact"/>
-            </w:pPr>
-            <w:r>
-              <w:rPr>
-                <w:rStyle w:val="VerbatimChar"/>
-              </w:rPr>
-              <w:t xml:space="preserve">created_at</w:t>
-            </w:r>
-          </w:p>
-        </w:tc>
-        <w:tc>
-          <w:tcPr/>
-          <w:p>
-            <w:pPr>
-              <w:pStyle w:val="Compact"/>
-            </w:pPr>
-            <w:r>
-              <w:t xml:space="preserve">timestamptz default now</w:t>
-            </w:r>
-          </w:p>
-        </w:tc>
-        <w:tc>
-          <w:tcPr/>
-          <w:p>
-            <w:pPr>
-              <w:pStyle w:val="Compact"/>
-            </w:pPr>
-          </w:p>
-        </w:tc>
-      </w:tr>
-    </w:tbl>
-    <w:bookmarkEnd w:id="11"/>
-    <w:bookmarkStart w:id="12" w:name="briefings-one-per-day"/>
-    <w:p>
-      <w:pPr>
-        <w:pStyle w:val="Heading3"/>
-      </w:pPr>
-      <w:r>
-        <w:rPr>
-          <w:rStyle w:val="VerbatimChar"/>
-        </w:rPr>
-        <w:t xml:space="preserve">briefings</w:t>
-      </w:r>
-      <w:r>
-        <w:t xml:space="preserve"> </w:t>
-      </w:r>
-      <w:r>
-        <w:t xml:space="preserve">— one per day</w:t>
-      </w:r>
-    </w:p>
-    <w:tbl>
-      <w:tblPr>
-        <w:tblStyle w:val="Table"/>
-        <w:tblW w:type="auto" w:w="0"/>
-        <w:tblLook w:firstRow="1" w:lastRow="0" w:firstColumn="0" w:lastColumn="0" w:noHBand="0" w:noVBand="0" w:val="0020"/>
-      </w:tblPr>
-      <w:tblGrid>
-        <w:gridCol w:w="2640"/>
-        <w:gridCol w:w="2640"/>
-        <w:gridCol w:w="2640"/>
-      </w:tblGrid>
-      <w:tr>
-        <w:trPr>
-          <w:tblHeader w:val="on"/>
-        </w:trPr>
-        <w:tc>
-          <w:tcPr/>
-          <w:p>
-            <w:pPr>
-              <w:pStyle w:val="Compact"/>
-            </w:pPr>
-            <w:r>
-              <w:t xml:space="preserve">Column</w:t>
-            </w:r>
-          </w:p>
-        </w:tc>
-        <w:tc>
-          <w:tcPr/>
-          <w:p>
-            <w:pPr>
-              <w:pStyle w:val="Compact"/>
-            </w:pPr>
-            <w:r>
-              <w:t xml:space="preserve">Type</w:t>
-            </w:r>
-          </w:p>
-        </w:tc>
-        <w:tc>
-          <w:tcPr/>
-          <w:p>
-            <w:pPr>
-              <w:pStyle w:val="Compact"/>
-            </w:pPr>
-            <w:r>
-              <w:t xml:space="preserve">Notes</w:t>
-            </w:r>
-          </w:p>
-        </w:tc>
-      </w:tr>
-      <w:tr>
-        <w:tc>
-          <w:tcPr/>
-          <w:p>
-            <w:pPr>
-              <w:pStyle w:val="Compact"/>
-            </w:pPr>
-            <w:r>
-              <w:rPr>
-                <w:rStyle w:val="VerbatimChar"/>
-              </w:rPr>
-              <w:t xml:space="preserve">id</w:t>
-            </w:r>
-          </w:p>
-        </w:tc>
-        <w:tc>
-          <w:tcPr/>
-          <w:p>
-            <w:pPr>
-              <w:pStyle w:val="Compact"/>
-            </w:pPr>
-            <w:r>
-              <w:t xml:space="preserve">uuid PK</w:t>
-            </w:r>
-          </w:p>
-        </w:tc>
-        <w:tc>
-          <w:tcPr/>
-          <w:p>
-            <w:pPr>
-              <w:pStyle w:val="Compact"/>
-            </w:pPr>
-          </w:p>
-        </w:tc>
-      </w:tr>
-      <w:tr>
-        <w:tc>
-          <w:tcPr/>
-          <w:p>
-            <w:pPr>
-              <w:pStyle w:val="Compact"/>
-            </w:pPr>
-            <w:r>
-              <w:rPr>
-                <w:rStyle w:val="VerbatimChar"/>
-              </w:rPr>
-              <w:t xml:space="preserve">date</w:t>
-            </w:r>
-          </w:p>
-        </w:tc>
-        <w:tc>
-          <w:tcPr/>
-          <w:p>
-            <w:pPr>
-              <w:pStyle w:val="Compact"/>
-            </w:pPr>
-            <w:r>
-              <w:t xml:space="preserve">date unique</w:t>
-            </w:r>
-          </w:p>
-        </w:tc>
-        <w:tc>
-          <w:tcPr/>
-          <w:p>
-            <w:pPr>
-              <w:pStyle w:val="Compact"/>
-            </w:pPr>
-            <w:r>
-              <w:t xml:space="preserve">the briefing day</w:t>
-            </w:r>
-          </w:p>
-        </w:tc>
-      </w:tr>
-      <w:tr>
-        <w:tc>
-          <w:tcPr/>
-          <w:p>
-            <w:pPr>
-              <w:pStyle w:val="Compact"/>
-            </w:pPr>
-            <w:r>
-              <w:rPr>
-                <w:rStyle w:val="VerbatimChar"/>
-              </w:rPr>
-              <w:t xml:space="preserve">headline</w:t>
-            </w:r>
-          </w:p>
-        </w:tc>
-        <w:tc>
-          <w:tcPr/>
-          <w:p>
-            <w:pPr>
-              <w:pStyle w:val="Compact"/>
-            </w:pPr>
-            <w:r>
-              <w:t xml:space="preserve">text</w:t>
-            </w:r>
-          </w:p>
-        </w:tc>
-        <w:tc>
-          <w:tcPr/>
-          <w:p>
-            <w:pPr>
-              <w:pStyle w:val="Compact"/>
-            </w:pPr>
-          </w:p>
-        </w:tc>
-      </w:tr>
-      <w:tr>
-        <w:tc>
-          <w:tcPr/>
-          <w:p>
-            <w:pPr>
-              <w:pStyle w:val="Compact"/>
-            </w:pPr>
-            <w:r>
-              <w:rPr>
-                <w:rStyle w:val="VerbatimChar"/>
-              </w:rPr>
-              <w:t xml:space="preserve">overall_sentiment</w:t>
-            </w:r>
-          </w:p>
-        </w:tc>
-        <w:tc>
-          <w:tcPr/>
-          <w:p>
-            <w:pPr>
-              <w:pStyle w:val="Compact"/>
-            </w:pPr>
-            <w:r>
-              <w:t xml:space="preserve">text</w:t>
-            </w:r>
-          </w:p>
-        </w:tc>
-        <w:tc>
-          <w:tcPr/>
-          <w:p>
-            <w:pPr>
-              <w:pStyle w:val="Compact"/>
-            </w:pPr>
-            <w:r>
-              <w:rPr>
-                <w:rStyle w:val="VerbatimChar"/>
-              </w:rPr>
-              <w:t xml:space="preserve">bullish</w:t>
-            </w:r>
-            <w:r>
-              <w:t xml:space="preserve">/</w:t>
-            </w:r>
-            <w:r>
-              <w:rPr>
-                <w:rStyle w:val="VerbatimChar"/>
-              </w:rPr>
-              <w:t xml:space="preserve">neutral</w:t>
-            </w:r>
-            <w:r>
-              <w:t xml:space="preserve">/</w:t>
-            </w:r>
-            <w:r>
-              <w:rPr>
-                <w:rStyle w:val="VerbatimChar"/>
-              </w:rPr>
-              <w:t xml:space="preserve">bearish</w:t>
-            </w:r>
-          </w:p>
-        </w:tc>
-      </w:tr>
-      <w:tr>
-        <w:tc>
-          <w:tcPr/>
-          <w:p>
-            <w:pPr>
-              <w:pStyle w:val="Compact"/>
-            </w:pPr>
-            <w:r>
-              <w:rPr>
-                <w:rStyle w:val="VerbatimChar"/>
-              </w:rPr>
-              <w:t xml:space="preserve">beginner_md</w:t>
-            </w:r>
-          </w:p>
-        </w:tc>
-        <w:tc>
-          <w:tcPr/>
-          <w:p>
-            <w:pPr>
-              <w:pStyle w:val="Compact"/>
-            </w:pPr>
-            <w:r>
-              <w:t xml:space="preserve">text</w:t>
-            </w:r>
-          </w:p>
-        </w:tc>
-        <w:tc>
-          <w:tcPr/>
-          <w:p>
-            <w:pPr>
-              <w:pStyle w:val="Compact"/>
-            </w:pPr>
-          </w:p>
-        </w:tc>
-      </w:tr>
-      <w:tr>
-        <w:tc>
-          <w:tcPr/>
-          <w:p>
-            <w:pPr>
-              <w:pStyle w:val="Compact"/>
-            </w:pPr>
-            <w:r>
-              <w:rPr>
-                <w:rStyle w:val="VerbatimChar"/>
-              </w:rPr>
-              <w:t xml:space="preserve">pro_md</w:t>
-            </w:r>
-          </w:p>
-        </w:tc>
-        <w:tc>
-          <w:tcPr/>
-          <w:p>
-            <w:pPr>
-              <w:pStyle w:val="Compact"/>
-            </w:pPr>
-            <w:r>
-              <w:t xml:space="preserve">text</w:t>
-            </w:r>
-          </w:p>
-        </w:tc>
-        <w:tc>
-          <w:tcPr/>
-          <w:p>
-            <w:pPr>
-              <w:pStyle w:val="Compact"/>
-            </w:pPr>
-          </w:p>
-        </w:tc>
-      </w:tr>
-      <w:tr>
-        <w:tc>
-          <w:tcPr/>
-          <w:p>
-            <w:pPr>
-              <w:pStyle w:val="Compact"/>
-            </w:pPr>
-            <w:r>
-              <w:rPr>
-                <w:rStyle w:val="VerbatimChar"/>
-              </w:rPr>
-              <w:t xml:space="preserve">story_ids</w:t>
-            </w:r>
-          </w:p>
-        </w:tc>
-        <w:tc>
-          <w:tcPr/>
-          <w:p>
-            <w:pPr>
-              <w:pStyle w:val="Compact"/>
-            </w:pPr>
-            <w:r>
-              <w:t xml:space="preserve">uuid[]</w:t>
-            </w:r>
-          </w:p>
-        </w:tc>
-        <w:tc>
-          <w:tcPr/>
-          <w:p>
-            <w:pPr>
-              <w:pStyle w:val="Compact"/>
-            </w:pPr>
-            <w:r>
-              <w:t xml:space="preserve">the stories featured</w:t>
-            </w:r>
-          </w:p>
-        </w:tc>
-      </w:tr>
-      <w:tr>
-        <w:tc>
-          <w:tcPr/>
-          <w:p>
-            <w:pPr>
-              <w:pStyle w:val="Compact"/>
-            </w:pPr>
-            <w:r>
-              <w:rPr>
-                <w:rStyle w:val="VerbatimChar"/>
-              </w:rPr>
-              <w:t xml:space="preserve">status</w:t>
-            </w:r>
-          </w:p>
-        </w:tc>
-        <w:tc>
-          <w:tcPr/>
-          <w:p>
-            <w:pPr>
-              <w:pStyle w:val="Compact"/>
-            </w:pPr>
-            <w:r>
-              <w:t xml:space="preserve">text</w:t>
-            </w:r>
-          </w:p>
-        </w:tc>
-        <w:tc>
-          <w:tcPr/>
-          <w:p>
-            <w:pPr>
-              <w:pStyle w:val="Compact"/>
-            </w:pPr>
-            <w:r>
-              <w:rPr>
-                <w:rStyle w:val="VerbatimChar"/>
-              </w:rPr>
-              <w:t xml:space="preserve">draft</w:t>
-            </w:r>
-            <w:r>
-              <w:t xml:space="preserve">/</w:t>
-            </w:r>
-            <w:r>
-              <w:rPr>
-                <w:rStyle w:val="VerbatimChar"/>
-              </w:rPr>
-              <w:t xml:space="preserve">published</w:t>
-            </w:r>
-          </w:p>
-        </w:tc>
-      </w:tr>
-      <w:tr>
-        <w:tc>
-          <w:tcPr/>
-          <w:p>
-            <w:pPr>
-              <w:pStyle w:val="Compact"/>
-            </w:pPr>
-            <w:r>
-              <w:rPr>
-                <w:rStyle w:val="VerbatimChar"/>
-              </w:rPr>
-              <w:t xml:space="preserve">created_at</w:t>
-            </w:r>
-          </w:p>
-        </w:tc>
-        <w:tc>
-          <w:tcPr/>
-          <w:p>
-            <w:pPr>
-              <w:pStyle w:val="Compact"/>
-            </w:pPr>
-            <w:r>
-              <w:t xml:space="preserve">timestamptz default now</w:t>
-            </w:r>
-          </w:p>
-        </w:tc>
-        <w:tc>
-          <w:tcPr/>
-          <w:p>
-            <w:pPr>
-              <w:pStyle w:val="Compact"/>
-            </w:pPr>
-          </w:p>
-        </w:tc>
-      </w:tr>
-    </w:tbl>
-    <w:bookmarkEnd w:id="12"/>
-    <w:bookmarkStart w:id="13" w:name="X24f77eea2447713c6a87b0714246bd0915ac071"/>
-    <w:p>
-      <w:pPr>
-        <w:pStyle w:val="Heading3"/>
-      </w:pPr>
-      <w:r>
-        <w:rPr>
-          <w:rStyle w:val="VerbatimChar"/>
-        </w:rPr>
-        <w:t xml:space="preserve">questions</w:t>
-      </w:r>
-      <w:r>
-        <w:t xml:space="preserve"> </w:t>
-      </w:r>
-      <w:r>
-        <w:t xml:space="preserve">— on-demand analysis (the poller’s queue)</w:t>
+        <w:t xml:space="preserve">sources</w:t>
+      </w:r>
+      <w:r>
+        <w:t xml:space="preserve"> </w:t>
+      </w:r>
+      <w:r>
+        <w:t xml:space="preserve">— outlet reputation memory (D-014)</w:t>
       </w:r>
     </w:p>
     <w:tbl>
@@ -1724,332 +876,282 @@
               <w:rPr>
                 <w:rStyle w:val="VerbatimChar"/>
               </w:rPr>
-              <w:t xml:space="preserve">id</w:t>
-            </w:r>
-          </w:p>
-        </w:tc>
-        <w:tc>
-          <w:tcPr/>
-          <w:p>
-            <w:pPr>
-              <w:pStyle w:val="Compact"/>
-            </w:pPr>
-            <w:r>
-              <w:t xml:space="preserve">uuid PK</w:t>
-            </w:r>
-          </w:p>
-        </w:tc>
-        <w:tc>
-          <w:tcPr/>
-          <w:p>
-            <w:pPr>
-              <w:pStyle w:val="Compact"/>
-            </w:pPr>
-          </w:p>
-        </w:tc>
-      </w:tr>
-      <w:tr>
-        <w:tc>
-          <w:tcPr/>
-          <w:p>
-            <w:pPr>
-              <w:pStyle w:val="Compact"/>
-            </w:pPr>
-            <w:r>
-              <w:rPr>
-                <w:rStyle w:val="VerbatimChar"/>
-              </w:rPr>
-              <w:t xml:space="preserve">question</w:t>
-            </w:r>
-          </w:p>
-        </w:tc>
-        <w:tc>
-          <w:tcPr/>
-          <w:p>
-            <w:pPr>
-              <w:pStyle w:val="Compact"/>
-            </w:pPr>
-            <w:r>
-              <w:t xml:space="preserve">text</w:t>
-            </w:r>
-          </w:p>
-        </w:tc>
-        <w:tc>
-          <w:tcPr/>
-          <w:p>
-            <w:pPr>
-              <w:pStyle w:val="Compact"/>
-            </w:pPr>
-            <w:r>
-              <w:t xml:space="preserve">user input (length-capped, sanitized)</w:t>
-            </w:r>
-          </w:p>
-        </w:tc>
-      </w:tr>
-      <w:tr>
-        <w:tc>
-          <w:tcPr/>
-          <w:p>
-            <w:pPr>
-              <w:pStyle w:val="Compact"/>
-            </w:pPr>
-            <w:r>
-              <w:rPr>
-                <w:rStyle w:val="VerbatimChar"/>
-              </w:rPr>
-              <w:t xml:space="preserve">status</w:t>
-            </w:r>
-          </w:p>
-        </w:tc>
-        <w:tc>
-          <w:tcPr/>
-          <w:p>
-            <w:pPr>
-              <w:pStyle w:val="Compact"/>
-            </w:pPr>
-            <w:r>
-              <w:t xml:space="preserve">text</w:t>
-            </w:r>
-          </w:p>
-        </w:tc>
-        <w:tc>
-          <w:tcPr/>
-          <w:p>
-            <w:pPr>
-              <w:pStyle w:val="Compact"/>
-            </w:pPr>
-            <w:r>
-              <w:rPr>
-                <w:rStyle w:val="VerbatimChar"/>
-              </w:rPr>
-              <w:t xml:space="preserve">pending</w:t>
-            </w:r>
-            <w:r>
-              <w:t xml:space="preserve">→</w:t>
-            </w:r>
-            <w:r>
-              <w:rPr>
-                <w:rStyle w:val="VerbatimChar"/>
-              </w:rPr>
-              <w:t xml:space="preserve">processing</w:t>
-            </w:r>
-            <w:r>
-              <w:t xml:space="preserve">→</w:t>
-            </w:r>
-            <w:r>
-              <w:rPr>
-                <w:rStyle w:val="VerbatimChar"/>
-              </w:rPr>
-              <w:t xml:space="preserve">done</w:t>
-            </w:r>
-            <w:r>
-              <w:t xml:space="preserve">→</w:t>
-            </w:r>
-            <w:r>
-              <w:rPr>
-                <w:rStyle w:val="VerbatimChar"/>
-              </w:rPr>
-              <w:t xml:space="preserve">error</w:t>
-            </w:r>
-          </w:p>
-        </w:tc>
-      </w:tr>
-      <w:tr>
-        <w:tc>
-          <w:tcPr/>
-          <w:p>
-            <w:pPr>
-              <w:pStyle w:val="Compact"/>
-            </w:pPr>
-            <w:r>
-              <w:rPr>
-                <w:rStyle w:val="VerbatimChar"/>
-              </w:rPr>
-              <w:t xml:space="preserve">beginner_md</w:t>
-            </w:r>
-          </w:p>
-        </w:tc>
-        <w:tc>
-          <w:tcPr/>
-          <w:p>
-            <w:pPr>
-              <w:pStyle w:val="Compact"/>
-            </w:pPr>
-            <w:r>
-              <w:t xml:space="preserve">text null</w:t>
-            </w:r>
-          </w:p>
-        </w:tc>
-        <w:tc>
-          <w:tcPr/>
-          <w:p>
-            <w:pPr>
-              <w:pStyle w:val="Compact"/>
-            </w:pPr>
-          </w:p>
-        </w:tc>
-      </w:tr>
-      <w:tr>
-        <w:tc>
-          <w:tcPr/>
-          <w:p>
-            <w:pPr>
-              <w:pStyle w:val="Compact"/>
-            </w:pPr>
-            <w:r>
-              <w:rPr>
-                <w:rStyle w:val="VerbatimChar"/>
-              </w:rPr>
-              <w:t xml:space="preserve">pro_md</w:t>
-            </w:r>
-          </w:p>
-        </w:tc>
-        <w:tc>
-          <w:tcPr/>
-          <w:p>
-            <w:pPr>
-              <w:pStyle w:val="Compact"/>
-            </w:pPr>
-            <w:r>
-              <w:t xml:space="preserve">text null</w:t>
-            </w:r>
-          </w:p>
-        </w:tc>
-        <w:tc>
-          <w:tcPr/>
-          <w:p>
-            <w:pPr>
-              <w:pStyle w:val="Compact"/>
-            </w:pPr>
-          </w:p>
-        </w:tc>
-      </w:tr>
-      <w:tr>
-        <w:tc>
-          <w:tcPr/>
-          <w:p>
-            <w:pPr>
-              <w:pStyle w:val="Compact"/>
-            </w:pPr>
-            <w:r>
-              <w:rPr>
-                <w:rStyle w:val="VerbatimChar"/>
-              </w:rPr>
-              <w:t xml:space="preserve">story_id</w:t>
-            </w:r>
-          </w:p>
-        </w:tc>
-        <w:tc>
-          <w:tcPr/>
-          <w:p>
-            <w:pPr>
-              <w:pStyle w:val="Compact"/>
-            </w:pPr>
-            <w:r>
-              <w:t xml:space="preserve">uuid null FK</w:t>
-            </w:r>
-          </w:p>
-        </w:tc>
-        <w:tc>
-          <w:tcPr/>
-          <w:p>
-            <w:pPr>
-              <w:pStyle w:val="Compact"/>
-            </w:pPr>
-            <w:r>
-              <w:t xml:space="preserve">the cluster built for this question</w:t>
-            </w:r>
-          </w:p>
-        </w:tc>
-      </w:tr>
-      <w:tr>
-        <w:tc>
-          <w:tcPr/>
-          <w:p>
-            <w:pPr>
-              <w:pStyle w:val="Compact"/>
-            </w:pPr>
-            <w:r>
-              <w:rPr>
-                <w:rStyle w:val="VerbatimChar"/>
-              </w:rPr>
-              <w:t xml:space="preserve">error</w:t>
-            </w:r>
-          </w:p>
-        </w:tc>
-        <w:tc>
-          <w:tcPr/>
-          <w:p>
-            <w:pPr>
-              <w:pStyle w:val="Compact"/>
-            </w:pPr>
-            <w:r>
-              <w:t xml:space="preserve">text null</w:t>
-            </w:r>
-          </w:p>
-        </w:tc>
-        <w:tc>
-          <w:tcPr/>
-          <w:p>
-            <w:pPr>
-              <w:pStyle w:val="Compact"/>
-            </w:pPr>
-            <w:r>
-              <w:t xml:space="preserve">populated on failure</w:t>
-            </w:r>
-          </w:p>
-        </w:tc>
-      </w:tr>
-      <w:tr>
-        <w:tc>
-          <w:tcPr/>
-          <w:p>
-            <w:pPr>
-              <w:pStyle w:val="Compact"/>
-            </w:pPr>
-            <w:r>
-              <w:rPr>
-                <w:rStyle w:val="VerbatimChar"/>
-              </w:rPr>
-              <w:t xml:space="preserve">client_hash</w:t>
-            </w:r>
-          </w:p>
-        </w:tc>
-        <w:tc>
-          <w:tcPr/>
-          <w:p>
-            <w:pPr>
-              <w:pStyle w:val="Compact"/>
-            </w:pPr>
-            <w:r>
-              <w:t xml:space="preserve">text null</w:t>
-            </w:r>
-          </w:p>
-        </w:tc>
-        <w:tc>
-          <w:tcPr/>
-          <w:p>
-            <w:pPr>
-              <w:pStyle w:val="Compact"/>
-            </w:pPr>
-            <w:r>
-              <w:t xml:space="preserve">salted hash of IP for rate limiting (not the IP)</w:t>
-            </w:r>
-          </w:p>
-        </w:tc>
-      </w:tr>
-      <w:tr>
-        <w:tc>
-          <w:tcPr/>
-          <w:p>
-            <w:pPr>
-              <w:pStyle w:val="Compact"/>
-            </w:pPr>
-            <w:r>
-              <w:rPr>
-                <w:rStyle w:val="VerbatimChar"/>
-              </w:rPr>
-              <w:t xml:space="preserve">created_at</w:t>
+              <w:t xml:space="preserve">name</w:t>
+            </w:r>
+          </w:p>
+        </w:tc>
+        <w:tc>
+          <w:tcPr/>
+          <w:p>
+            <w:pPr>
+              <w:pStyle w:val="Compact"/>
+            </w:pPr>
+            <w:r>
+              <w:t xml:space="preserve">text PK</w:t>
+            </w:r>
+          </w:p>
+        </w:tc>
+        <w:tc>
+          <w:tcPr/>
+          <w:p>
+            <w:pPr>
+              <w:pStyle w:val="Compact"/>
+            </w:pPr>
+            <w:r>
+              <w:t xml:space="preserve">outlet name; matches</w:t>
+            </w:r>
+            <w:r>
+              <w:t xml:space="preserve"> </w:t>
+            </w:r>
+            <w:r>
+              <w:rPr>
+                <w:rStyle w:val="VerbatimChar"/>
+              </w:rPr>
+              <w:t xml:space="preserve">articles.source</w:t>
+            </w:r>
+          </w:p>
+        </w:tc>
+      </w:tr>
+      <w:tr>
+        <w:tc>
+          <w:tcPr/>
+          <w:p>
+            <w:pPr>
+              <w:pStyle w:val="Compact"/>
+            </w:pPr>
+            <w:r>
+              <w:rPr>
+                <w:rStyle w:val="VerbatimChar"/>
+              </w:rPr>
+              <w:t xml:space="preserve">article_count</w:t>
+            </w:r>
+          </w:p>
+        </w:tc>
+        <w:tc>
+          <w:tcPr/>
+          <w:p>
+            <w:pPr>
+              <w:pStyle w:val="Compact"/>
+            </w:pPr>
+            <w:r>
+              <w:t xml:space="preserve">int default 0</w:t>
+            </w:r>
+          </w:p>
+        </w:tc>
+        <w:tc>
+          <w:tcPr/>
+          <w:p>
+            <w:pPr>
+              <w:pStyle w:val="Compact"/>
+            </w:pPr>
+            <w:r>
+              <w:t xml:space="preserve">articles seen from this outlet</w:t>
+            </w:r>
+          </w:p>
+        </w:tc>
+      </w:tr>
+      <w:tr>
+        <w:tc>
+          <w:tcPr/>
+          <w:p>
+            <w:pPr>
+              <w:pStyle w:val="Compact"/>
+            </w:pPr>
+            <w:r>
+              <w:rPr>
+                <w:rStyle w:val="VerbatimChar"/>
+              </w:rPr>
+              <w:t xml:space="preserve">lean_left</w:t>
+            </w:r>
+          </w:p>
+        </w:tc>
+        <w:tc>
+          <w:tcPr/>
+          <w:p>
+            <w:pPr>
+              <w:pStyle w:val="Compact"/>
+            </w:pPr>
+            <w:r>
+              <w:t xml:space="preserve">int default 0</w:t>
+            </w:r>
+          </w:p>
+        </w:tc>
+        <w:tc>
+          <w:tcPr/>
+          <w:p>
+            <w:pPr>
+              <w:pStyle w:val="Compact"/>
+            </w:pPr>
+            <w:r>
+              <w:t xml:space="preserve">running tally of left-rated articles</w:t>
+            </w:r>
+          </w:p>
+        </w:tc>
+      </w:tr>
+      <w:tr>
+        <w:tc>
+          <w:tcPr/>
+          <w:p>
+            <w:pPr>
+              <w:pStyle w:val="Compact"/>
+            </w:pPr>
+            <w:r>
+              <w:rPr>
+                <w:rStyle w:val="VerbatimChar"/>
+              </w:rPr>
+              <w:t xml:space="preserve">lean_center</w:t>
+            </w:r>
+          </w:p>
+        </w:tc>
+        <w:tc>
+          <w:tcPr/>
+          <w:p>
+            <w:pPr>
+              <w:pStyle w:val="Compact"/>
+            </w:pPr>
+            <w:r>
+              <w:t xml:space="preserve">int default 0</w:t>
+            </w:r>
+          </w:p>
+        </w:tc>
+        <w:tc>
+          <w:tcPr/>
+          <w:p>
+            <w:pPr>
+              <w:pStyle w:val="Compact"/>
+            </w:pPr>
+            <w:r>
+              <w:t xml:space="preserve">running tally of center-rated articles</w:t>
+            </w:r>
+          </w:p>
+        </w:tc>
+      </w:tr>
+      <w:tr>
+        <w:tc>
+          <w:tcPr/>
+          <w:p>
+            <w:pPr>
+              <w:pStyle w:val="Compact"/>
+            </w:pPr>
+            <w:r>
+              <w:rPr>
+                <w:rStyle w:val="VerbatimChar"/>
+              </w:rPr>
+              <w:t xml:space="preserve">lean_right</w:t>
+            </w:r>
+          </w:p>
+        </w:tc>
+        <w:tc>
+          <w:tcPr/>
+          <w:p>
+            <w:pPr>
+              <w:pStyle w:val="Compact"/>
+            </w:pPr>
+            <w:r>
+              <w:t xml:space="preserve">int default 0</w:t>
+            </w:r>
+          </w:p>
+        </w:tc>
+        <w:tc>
+          <w:tcPr/>
+          <w:p>
+            <w:pPr>
+              <w:pStyle w:val="Compact"/>
+            </w:pPr>
+            <w:r>
+              <w:t xml:space="preserve">running tally of right-rated articles</w:t>
+            </w:r>
+          </w:p>
+        </w:tc>
+      </w:tr>
+      <w:tr>
+        <w:tc>
+          <w:tcPr/>
+          <w:p>
+            <w:pPr>
+              <w:pStyle w:val="Compact"/>
+            </w:pPr>
+            <w:r>
+              <w:rPr>
+                <w:rStyle w:val="VerbatimChar"/>
+              </w:rPr>
+              <w:t xml:space="preserve">divergence_avg</w:t>
+            </w:r>
+          </w:p>
+        </w:tc>
+        <w:tc>
+          <w:tcPr/>
+          <w:p>
+            <w:pPr>
+              <w:pStyle w:val="Compact"/>
+            </w:pPr>
+            <w:r>
+              <w:t xml:space="preserve">real</w:t>
+            </w:r>
+          </w:p>
+        </w:tc>
+        <w:tc>
+          <w:tcPr/>
+          <w:p>
+            <w:pPr>
+              <w:pStyle w:val="Compact"/>
+            </w:pPr>
+            <w:r>
+              <w:t xml:space="preserve">avg distance of this outlet’s framing from the neutral synthesis</w:t>
+            </w:r>
+          </w:p>
+        </w:tc>
+      </w:tr>
+      <w:tr>
+        <w:tc>
+          <w:tcPr/>
+          <w:p>
+            <w:pPr>
+              <w:pStyle w:val="Compact"/>
+            </w:pPr>
+            <w:r>
+              <w:rPr>
+                <w:rStyle w:val="VerbatimChar"/>
+              </w:rPr>
+              <w:t xml:space="preserve">reliability</w:t>
+            </w:r>
+          </w:p>
+        </w:tc>
+        <w:tc>
+          <w:tcPr/>
+          <w:p>
+            <w:pPr>
+              <w:pStyle w:val="Compact"/>
+            </w:pPr>
+            <w:r>
+              <w:t xml:space="preserve">real</w:t>
+            </w:r>
+          </w:p>
+        </w:tc>
+        <w:tc>
+          <w:tcPr/>
+          <w:p>
+            <w:pPr>
+              <w:pStyle w:val="Compact"/>
+            </w:pPr>
+            <w:r>
+              <w:t xml:space="preserve">0–1 running reliability estimate</w:t>
+            </w:r>
+          </w:p>
+        </w:tc>
+      </w:tr>
+      <w:tr>
+        <w:tc>
+          <w:tcPr/>
+          <w:p>
+            <w:pPr>
+              <w:pStyle w:val="Compact"/>
+            </w:pPr>
+            <w:r>
+              <w:rPr>
+                <w:rStyle w:val="VerbatimChar"/>
+              </w:rPr>
+              <w:t xml:space="preserve">updated_at</w:t>
             </w:r>
           </w:p>
         </w:tc>
@@ -2073,44 +1175,50 @@
           </w:p>
         </w:tc>
       </w:tr>
-      <w:tr>
-        <w:tc>
-          <w:tcPr/>
-          <w:p>
-            <w:pPr>
-              <w:pStyle w:val="Compact"/>
-            </w:pPr>
-            <w:r>
-              <w:rPr>
-                <w:rStyle w:val="VerbatimChar"/>
-              </w:rPr>
-              <w:t xml:space="preserve">processed_at</w:t>
-            </w:r>
-          </w:p>
-        </w:tc>
-        <w:tc>
-          <w:tcPr/>
-          <w:p>
-            <w:pPr>
-              <w:pStyle w:val="Compact"/>
-            </w:pPr>
-            <w:r>
-              <w:t xml:space="preserve">timestamptz null</w:t>
-            </w:r>
-          </w:p>
-        </w:tc>
-        <w:tc>
-          <w:tcPr/>
-          <w:p>
-            <w:pPr>
-              <w:pStyle w:val="Compact"/>
-            </w:pPr>
-          </w:p>
-        </w:tc>
-      </w:tr>
     </w:tbl>
-    <w:bookmarkEnd w:id="13"/>
-    <w:bookmarkStart w:id="14" w:name="agent_runs-optional-developer-view"/>
+    <w:p>
+      <w:pPr>
+        <w:pStyle w:val="BlockText"/>
+      </w:pPr>
+      <w:r>
+        <w:t xml:space="preserve">The Bias agent reads this as a prior (</w:t>
+      </w:r>
+      <w:r>
+        <w:t xml:space="preserve">“this outlet historically leans X across N</w:t>
+      </w:r>
+      <w:r>
+        <w:t xml:space="preserve"> </w:t>
+      </w:r>
+      <w:r>
+        <w:t xml:space="preserve">articles”</w:t>
+      </w:r>
+      <w:r>
+        <w:t xml:space="preserve">) and updates it after each analysis. Added via migration</w:t>
+      </w:r>
+      <w:r>
+        <w:t xml:space="preserve"> </w:t>
+      </w:r>
+      <w:r>
+        <w:rPr>
+          <w:rStyle w:val="VerbatimChar"/>
+        </w:rPr>
+        <w:t xml:space="preserve">0002</w:t>
+      </w:r>
+      <w:r>
+        <w:t xml:space="preserve"> </w:t>
+      </w:r>
+      <w:r>
+        <w:t xml:space="preserve">in Plan 2.</w:t>
+      </w:r>
+      <w:r>
+        <w:t xml:space="preserve"> </w:t>
+      </w:r>
+      <w:r>
+        <w:t xml:space="preserve">Author-level reputation is deferred (D-014).</w:t>
+      </w:r>
+    </w:p>
+    <w:bookmarkEnd w:id="11"/>
+    <w:bookmarkStart w:id="12" w:name="stories-one-per-clustered-topic"/>
     <w:p>
       <w:pPr>
         <w:pStyle w:val="Heading3"/>
@@ -2119,17 +1227,735 @@
         <w:rPr>
           <w:rStyle w:val="VerbatimChar"/>
         </w:rPr>
-        <w:t xml:space="preserve">agent_runs</w:t>
-      </w:r>
-      <w:r>
-        <w:t xml:space="preserve"> </w:t>
-      </w:r>
+        <w:t xml:space="preserve">stories</w:t>
+      </w:r>
+      <w:r>
+        <w:t xml:space="preserve"> </w:t>
+      </w:r>
+      <w:r>
+        <w:t xml:space="preserve">— one per clustered topic</w:t>
+      </w:r>
+    </w:p>
+    <w:tbl>
+      <w:tblPr>
+        <w:tblStyle w:val="Table"/>
+        <w:tblW w:type="pct" w:w="5000"/>
+        <w:tblLayout w:type="fixed"/>
+        <w:tblLook w:firstRow="1" w:lastRow="0" w:firstColumn="0" w:lastColumn="0" w:noHBand="0" w:noVBand="0" w:val="0020"/>
+      </w:tblPr>
+      <w:tblGrid>
+        <w:gridCol w:w="3017"/>
+        <w:gridCol w:w="2262"/>
+        <w:gridCol w:w="2640"/>
+      </w:tblGrid>
+      <w:tr>
+        <w:trPr>
+          <w:tblHeader w:val="on"/>
+        </w:trPr>
+        <w:tc>
+          <w:tcPr/>
+          <w:p>
+            <w:pPr>
+              <w:pStyle w:val="Compact"/>
+            </w:pPr>
+            <w:r>
+              <w:t xml:space="preserve">Column</w:t>
+            </w:r>
+          </w:p>
+        </w:tc>
+        <w:tc>
+          <w:tcPr/>
+          <w:p>
+            <w:pPr>
+              <w:pStyle w:val="Compact"/>
+            </w:pPr>
+            <w:r>
+              <w:t xml:space="preserve">Type</w:t>
+            </w:r>
+          </w:p>
+        </w:tc>
+        <w:tc>
+          <w:tcPr/>
+          <w:p>
+            <w:pPr>
+              <w:pStyle w:val="Compact"/>
+            </w:pPr>
+            <w:r>
+              <w:t xml:space="preserve">Notes</w:t>
+            </w:r>
+          </w:p>
+        </w:tc>
+      </w:tr>
+      <w:tr>
+        <w:tc>
+          <w:tcPr/>
+          <w:p>
+            <w:pPr>
+              <w:pStyle w:val="Compact"/>
+            </w:pPr>
+            <w:r>
+              <w:rPr>
+                <w:rStyle w:val="VerbatimChar"/>
+              </w:rPr>
+              <w:t xml:space="preserve">id</w:t>
+            </w:r>
+          </w:p>
+        </w:tc>
+        <w:tc>
+          <w:tcPr/>
+          <w:p>
+            <w:pPr>
+              <w:pStyle w:val="Compact"/>
+            </w:pPr>
+            <w:r>
+              <w:t xml:space="preserve">uuid PK</w:t>
+            </w:r>
+          </w:p>
+        </w:tc>
+        <w:tc>
+          <w:tcPr/>
+          <w:p>
+            <w:pPr>
+              <w:pStyle w:val="Compact"/>
+            </w:pPr>
+          </w:p>
+        </w:tc>
+      </w:tr>
+      <w:tr>
+        <w:tc>
+          <w:tcPr/>
+          <w:p>
+            <w:pPr>
+              <w:pStyle w:val="Compact"/>
+            </w:pPr>
+            <w:r>
+              <w:rPr>
+                <w:rStyle w:val="VerbatimChar"/>
+              </w:rPr>
+              <w:t xml:space="preserve">topic</w:t>
+            </w:r>
+          </w:p>
+        </w:tc>
+        <w:tc>
+          <w:tcPr/>
+          <w:p>
+            <w:pPr>
+              <w:pStyle w:val="Compact"/>
+            </w:pPr>
+            <w:r>
+              <w:t xml:space="preserve">text</w:t>
+            </w:r>
+          </w:p>
+        </w:tc>
+        <w:tc>
+          <w:tcPr/>
+          <w:p>
+            <w:pPr>
+              <w:pStyle w:val="Compact"/>
+            </w:pPr>
+            <w:r>
+              <w:t xml:space="preserve">short canonical title for the event</w:t>
+            </w:r>
+          </w:p>
+        </w:tc>
+      </w:tr>
+      <w:tr>
+        <w:tc>
+          <w:tcPr/>
+          <w:p>
+            <w:pPr>
+              <w:pStyle w:val="Compact"/>
+            </w:pPr>
+            <w:r>
+              <w:rPr>
+                <w:rStyle w:val="VerbatimChar"/>
+              </w:rPr>
+              <w:t xml:space="preserve">first_seen</w:t>
+            </w:r>
+          </w:p>
+        </w:tc>
+        <w:tc>
+          <w:tcPr/>
+          <w:p>
+            <w:pPr>
+              <w:pStyle w:val="Compact"/>
+            </w:pPr>
+            <w:r>
+              <w:t xml:space="preserve">timestamptz</w:t>
+            </w:r>
+          </w:p>
+        </w:tc>
+        <w:tc>
+          <w:tcPr/>
+          <w:p>
+            <w:pPr>
+              <w:pStyle w:val="Compact"/>
+            </w:pPr>
+          </w:p>
+        </w:tc>
+      </w:tr>
+      <w:tr>
+        <w:tc>
+          <w:tcPr/>
+          <w:p>
+            <w:pPr>
+              <w:pStyle w:val="Compact"/>
+            </w:pPr>
+            <w:r>
+              <w:rPr>
+                <w:rStyle w:val="VerbatimChar"/>
+              </w:rPr>
+              <w:t xml:space="preserve">source_count</w:t>
+            </w:r>
+          </w:p>
+        </w:tc>
+        <w:tc>
+          <w:tcPr/>
+          <w:p>
+            <w:pPr>
+              <w:pStyle w:val="Compact"/>
+            </w:pPr>
+            <w:r>
+              <w:t xml:space="preserve">int</w:t>
+            </w:r>
+          </w:p>
+        </w:tc>
+        <w:tc>
+          <w:tcPr/>
+          <w:p>
+            <w:pPr>
+              <w:pStyle w:val="Compact"/>
+            </w:pPr>
+            <w:r>
+              <w:t xml:space="preserve">number of articles in the cluster</w:t>
+            </w:r>
+          </w:p>
+        </w:tc>
+      </w:tr>
+      <w:tr>
+        <w:tc>
+          <w:tcPr/>
+          <w:p>
+            <w:pPr>
+              <w:pStyle w:val="Compact"/>
+            </w:pPr>
+            <w:r>
+              <w:rPr>
+                <w:rStyle w:val="VerbatimChar"/>
+              </w:rPr>
+              <w:t xml:space="preserve">lean_spread</w:t>
+            </w:r>
+          </w:p>
+        </w:tc>
+        <w:tc>
+          <w:tcPr/>
+          <w:p>
+            <w:pPr>
+              <w:pStyle w:val="Compact"/>
+            </w:pPr>
+            <w:r>
+              <w:t xml:space="preserve">jsonb</w:t>
+            </w:r>
+          </w:p>
+        </w:tc>
+        <w:tc>
+          <w:tcPr/>
+          <w:p>
+            <w:pPr>
+              <w:pStyle w:val="Compact"/>
+            </w:pPr>
+            <w:r>
+              <w:t xml:space="preserve">e.g. </w:t>
+            </w:r>
+            <w:r>
+              <w:rPr>
+                <w:rStyle w:val="VerbatimChar"/>
+              </w:rPr>
+              <w:t xml:space="preserve">{"left":5,"center":6,"right":3}</w:t>
+            </w:r>
+          </w:p>
+        </w:tc>
+      </w:tr>
+      <w:tr>
+        <w:tc>
+          <w:tcPr/>
+          <w:p>
+            <w:pPr>
+              <w:pStyle w:val="Compact"/>
+            </w:pPr>
+            <w:r>
+              <w:rPr>
+                <w:rStyle w:val="VerbatimChar"/>
+              </w:rPr>
+              <w:t xml:space="preserve">neutral_md</w:t>
+            </w:r>
+          </w:p>
+        </w:tc>
+        <w:tc>
+          <w:tcPr/>
+          <w:p>
+            <w:pPr>
+              <w:pStyle w:val="Compact"/>
+            </w:pPr>
+            <w:r>
+              <w:t xml:space="preserve">text</w:t>
+            </w:r>
+          </w:p>
+        </w:tc>
+        <w:tc>
+          <w:tcPr/>
+          <w:p>
+            <w:pPr>
+              <w:pStyle w:val="Compact"/>
+            </w:pPr>
+            <w:r>
+              <w:t xml:space="preserve">AI-neutral synthesis (markdown)</w:t>
+            </w:r>
+          </w:p>
+        </w:tc>
+      </w:tr>
+      <w:tr>
+        <w:tc>
+          <w:tcPr/>
+          <w:p>
+            <w:pPr>
+              <w:pStyle w:val="Compact"/>
+            </w:pPr>
+            <w:r>
+              <w:rPr>
+                <w:rStyle w:val="VerbatimChar"/>
+              </w:rPr>
+              <w:t xml:space="preserve">beginner_md</w:t>
+            </w:r>
+          </w:p>
+        </w:tc>
+        <w:tc>
+          <w:tcPr/>
+          <w:p>
+            <w:pPr>
+              <w:pStyle w:val="Compact"/>
+            </w:pPr>
+            <w:r>
+              <w:t xml:space="preserve">text</w:t>
+            </w:r>
+          </w:p>
+        </w:tc>
+        <w:tc>
+          <w:tcPr/>
+          <w:p>
+            <w:pPr>
+              <w:pStyle w:val="Compact"/>
+            </w:pPr>
+            <w:r>
+              <w:t xml:space="preserve">“what this means for you”</w:t>
+            </w:r>
+          </w:p>
+        </w:tc>
+      </w:tr>
+      <w:tr>
+        <w:tc>
+          <w:tcPr/>
+          <w:p>
+            <w:pPr>
+              <w:pStyle w:val="Compact"/>
+            </w:pPr>
+            <w:r>
+              <w:rPr>
+                <w:rStyle w:val="VerbatimChar"/>
+              </w:rPr>
+              <w:t xml:space="preserve">pro_md</w:t>
+            </w:r>
+          </w:p>
+        </w:tc>
+        <w:tc>
+          <w:tcPr/>
+          <w:p>
+            <w:pPr>
+              <w:pStyle w:val="Compact"/>
+            </w:pPr>
+            <w:r>
+              <w:t xml:space="preserve">text</w:t>
+            </w:r>
+          </w:p>
+        </w:tc>
+        <w:tc>
+          <w:tcPr/>
+          <w:p>
+            <w:pPr>
+              <w:pStyle w:val="Compact"/>
+            </w:pPr>
+            <w:r>
+              <w:t xml:space="preserve">game theory + market impact</w:t>
+            </w:r>
+          </w:p>
+        </w:tc>
+      </w:tr>
+      <w:tr>
+        <w:tc>
+          <w:tcPr/>
+          <w:p>
+            <w:pPr>
+              <w:pStyle w:val="Compact"/>
+            </w:pPr>
+            <w:r>
+              <w:rPr>
+                <w:rStyle w:val="VerbatimChar"/>
+              </w:rPr>
+              <w:t xml:space="preserve">sentiment</w:t>
+            </w:r>
+          </w:p>
+        </w:tc>
+        <w:tc>
+          <w:tcPr/>
+          <w:p>
+            <w:pPr>
+              <w:pStyle w:val="Compact"/>
+            </w:pPr>
+            <w:r>
+              <w:t xml:space="preserve">text</w:t>
+            </w:r>
+          </w:p>
+        </w:tc>
+        <w:tc>
+          <w:tcPr/>
+          <w:p>
+            <w:pPr>
+              <w:pStyle w:val="Compact"/>
+            </w:pPr>
+            <w:r>
+              <w:rPr>
+                <w:rStyle w:val="VerbatimChar"/>
+              </w:rPr>
+              <w:t xml:space="preserve">bullish</w:t>
+            </w:r>
+            <w:r>
+              <w:t xml:space="preserve"> </w:t>
+            </w:r>
+            <w:r>
+              <w:t xml:space="preserve">/</w:t>
+            </w:r>
+            <w:r>
+              <w:t xml:space="preserve"> </w:t>
+            </w:r>
+            <w:r>
+              <w:rPr>
+                <w:rStyle w:val="VerbatimChar"/>
+              </w:rPr>
+              <w:t xml:space="preserve">neutral</w:t>
+            </w:r>
+            <w:r>
+              <w:t xml:space="preserve"> </w:t>
+            </w:r>
+            <w:r>
+              <w:t xml:space="preserve">/</w:t>
+            </w:r>
+            <w:r>
+              <w:t xml:space="preserve"> </w:t>
+            </w:r>
+            <w:r>
+              <w:rPr>
+                <w:rStyle w:val="VerbatimChar"/>
+              </w:rPr>
+              <w:t xml:space="preserve">bearish</w:t>
+            </w:r>
+          </w:p>
+        </w:tc>
+      </w:tr>
+      <w:tr>
+        <w:tc>
+          <w:tcPr/>
+          <w:p>
+            <w:pPr>
+              <w:pStyle w:val="Compact"/>
+            </w:pPr>
+            <w:r>
+              <w:rPr>
+                <w:rStyle w:val="VerbatimChar"/>
+              </w:rPr>
+              <w:t xml:space="preserve">impact_score</w:t>
+            </w:r>
+          </w:p>
+        </w:tc>
+        <w:tc>
+          <w:tcPr/>
+          <w:p>
+            <w:pPr>
+              <w:pStyle w:val="Compact"/>
+            </w:pPr>
+            <w:r>
+              <w:t xml:space="preserve">int</w:t>
+            </w:r>
+          </w:p>
+        </w:tc>
+        <w:tc>
+          <w:tcPr/>
+          <w:p>
+            <w:pPr>
+              <w:pStyle w:val="Compact"/>
+            </w:pPr>
+            <w:r>
+              <w:t xml:space="preserve">0–100: economic impact on everyday life (D-012); drives ranking</w:t>
+            </w:r>
+          </w:p>
+        </w:tc>
+      </w:tr>
+      <w:tr>
+        <w:tc>
+          <w:tcPr/>
+          <w:p>
+            <w:pPr>
+              <w:pStyle w:val="Compact"/>
+            </w:pPr>
+            <w:r>
+              <w:rPr>
+                <w:rStyle w:val="VerbatimChar"/>
+              </w:rPr>
+              <w:t xml:space="preserve">impact_summary</w:t>
+            </w:r>
+          </w:p>
+        </w:tc>
+        <w:tc>
+          <w:tcPr/>
+          <w:p>
+            <w:pPr>
+              <w:pStyle w:val="Compact"/>
+            </w:pPr>
+            <w:r>
+              <w:t xml:space="preserve">text</w:t>
+            </w:r>
+          </w:p>
+        </w:tc>
+        <w:tc>
+          <w:tcPr/>
+          <w:p>
+            <w:pPr>
+              <w:pStyle w:val="Compact"/>
+            </w:pPr>
+            <w:r>
+              <w:t xml:space="preserve">one-line</w:t>
+            </w:r>
+            <w:r>
+              <w:t xml:space="preserve"> </w:t>
+            </w:r>
+            <w:r>
+              <w:t xml:space="preserve">“why this matters to you”</w:t>
+            </w:r>
+            <w:r>
+              <w:t xml:space="preserve"> </w:t>
+            </w:r>
+            <w:r>
+              <w:t xml:space="preserve">impact chain</w:t>
+            </w:r>
+          </w:p>
+        </w:tc>
+      </w:tr>
+      <w:tr>
+        <w:tc>
+          <w:tcPr/>
+          <w:p>
+            <w:pPr>
+              <w:pStyle w:val="Compact"/>
+            </w:pPr>
+            <w:r>
+              <w:rPr>
+                <w:rStyle w:val="VerbatimChar"/>
+              </w:rPr>
+              <w:t xml:space="preserve">affected_regions</w:t>
+            </w:r>
+          </w:p>
+        </w:tc>
+        <w:tc>
+          <w:tcPr/>
+          <w:p>
+            <w:pPr>
+              <w:pStyle w:val="Compact"/>
+            </w:pPr>
+            <w:r>
+              <w:t xml:space="preserve">text[]</w:t>
+            </w:r>
+          </w:p>
+        </w:tc>
+        <w:tc>
+          <w:tcPr/>
+          <w:p>
+            <w:pPr>
+              <w:pStyle w:val="Compact"/>
+            </w:pPr>
+            <w:r>
+              <w:t xml:space="preserve">regions the story economically touches, e.g. </w:t>
+            </w:r>
+            <w:r>
+              <w:rPr>
+                <w:rStyle w:val="VerbatimChar"/>
+              </w:rPr>
+              <w:t xml:space="preserve">{Indonesia,Global}</w:t>
+            </w:r>
+          </w:p>
+        </w:tc>
+      </w:tr>
+      <w:tr>
+        <w:tc>
+          <w:tcPr/>
+          <w:p>
+            <w:pPr>
+              <w:pStyle w:val="Compact"/>
+            </w:pPr>
+            <w:r>
+              <w:rPr>
+                <w:rStyle w:val="VerbatimChar"/>
+              </w:rPr>
+              <w:t xml:space="preserve">region_relevance</w:t>
+            </w:r>
+          </w:p>
+        </w:tc>
+        <w:tc>
+          <w:tcPr/>
+          <w:p>
+            <w:pPr>
+              <w:pStyle w:val="Compact"/>
+            </w:pPr>
+            <w:r>
+              <w:t xml:space="preserve">real</w:t>
+            </w:r>
+          </w:p>
+        </w:tc>
+        <w:tc>
+          <w:tcPr/>
+          <w:p>
+            <w:pPr>
+              <w:pStyle w:val="Compact"/>
+            </w:pPr>
+            <w:r>
+              <w:t xml:space="preserve">0–1: proximity to the configured</w:t>
+            </w:r>
+            <w:r>
+              <w:t xml:space="preserve"> </w:t>
+            </w:r>
+            <w:r>
+              <w:rPr>
+                <w:rStyle w:val="VerbatimChar"/>
+              </w:rPr>
+              <w:t xml:space="preserve">home_region</w:t>
+            </w:r>
+          </w:p>
+        </w:tc>
+      </w:tr>
+      <w:tr>
+        <w:tc>
+          <w:tcPr/>
+          <w:p>
+            <w:pPr>
+              <w:pStyle w:val="Compact"/>
+            </w:pPr>
+            <w:r>
+              <w:rPr>
+                <w:rStyle w:val="VerbatimChar"/>
+              </w:rPr>
+              <w:t xml:space="preserve">created_at</w:t>
+            </w:r>
+          </w:p>
+        </w:tc>
+        <w:tc>
+          <w:tcPr/>
+          <w:p>
+            <w:pPr>
+              <w:pStyle w:val="Compact"/>
+            </w:pPr>
+            <w:r>
+              <w:t xml:space="preserve">timestamptz default now</w:t>
+            </w:r>
+          </w:p>
+        </w:tc>
+        <w:tc>
+          <w:tcPr/>
+          <w:p>
+            <w:pPr>
+              <w:pStyle w:val="Compact"/>
+            </w:pPr>
+          </w:p>
+        </w:tc>
+      </w:tr>
+    </w:tbl>
+    <w:p>
+      <w:pPr>
+        <w:pStyle w:val="BlockText"/>
+      </w:pPr>
       <w:r>
         <w:rPr>
-          <w:i/>
-          <w:iCs/>
+          <w:b/>
+          <w:bCs/>
         </w:rPr>
-        <w:t xml:space="preserve">(optional, developer view)</w:t>
+        <w:t xml:space="preserve">Relevance ranking (D-012):</w:t>
+      </w:r>
+      <w:r>
+        <w:t xml:space="preserve"> </w:t>
+      </w:r>
+      <w:r>
+        <w:t xml:space="preserve">the home page orders stories by</w:t>
+      </w:r>
+      <w:r>
+        <w:t xml:space="preserve"> </w:t>
+      </w:r>
+      <w:r>
+        <w:rPr>
+          <w:rStyle w:val="VerbatimChar"/>
+        </w:rPr>
+        <w:t xml:space="preserve">impact_score × region_relevance</w:t>
+      </w:r>
+      <w:r>
+        <w:t xml:space="preserve">, not recency. Low-impact noise (celebrity/sports) is</w:t>
+      </w:r>
+      <w:r>
+        <w:t xml:space="preserve"> </w:t>
+      </w:r>
+      <w:r>
+        <w:t xml:space="preserve">scored near 0 and filtered by default.</w:t>
+      </w:r>
+      <w:r>
+        <w:t xml:space="preserve"> </w:t>
+      </w:r>
+      <w:r>
+        <w:rPr>
+          <w:rStyle w:val="VerbatimChar"/>
+        </w:rPr>
+        <w:t xml:space="preserve">home_region</w:t>
+      </w:r>
+      <w:r>
+        <w:t xml:space="preserve"> </w:t>
+      </w:r>
+      <w:r>
+        <w:t xml:space="preserve">lives in engine config (default</w:t>
+      </w:r>
+      <w:r>
+        <w:t xml:space="preserve"> </w:t>
+      </w:r>
+      <w:r>
+        <w:rPr>
+          <w:rStyle w:val="VerbatimChar"/>
+        </w:rPr>
+        <w:t xml:space="preserve">Indonesia</w:t>
+      </w:r>
+      <w:r>
+        <w:t xml:space="preserve">), not the DB — so fixed → geo-detected → user-chosen is a config change.</w:t>
+      </w:r>
+    </w:p>
+    <w:bookmarkEnd w:id="12"/>
+    <w:bookmarkStart w:id="13" w:name="briefings-one-per-day"/>
+    <w:p>
+      <w:pPr>
+        <w:pStyle w:val="Heading3"/>
+      </w:pPr>
+      <w:r>
+        <w:rPr>
+          <w:rStyle w:val="VerbatimChar"/>
+        </w:rPr>
+        <w:t xml:space="preserve">briefings</w:t>
+      </w:r>
+      <w:r>
+        <w:t xml:space="preserve"> </w:t>
+      </w:r>
+      <w:r>
+        <w:t xml:space="preserve">— one per day</w:t>
       </w:r>
     </w:p>
     <w:tbl>
@@ -2227,7 +2053,45 @@
               <w:rPr>
                 <w:rStyle w:val="VerbatimChar"/>
               </w:rPr>
-              <w:t xml:space="preserve">kind</w:t>
+              <w:t xml:space="preserve">date</w:t>
+            </w:r>
+          </w:p>
+        </w:tc>
+        <w:tc>
+          <w:tcPr/>
+          <w:p>
+            <w:pPr>
+              <w:pStyle w:val="Compact"/>
+            </w:pPr>
+            <w:r>
+              <w:t xml:space="preserve">date unique</w:t>
+            </w:r>
+          </w:p>
+        </w:tc>
+        <w:tc>
+          <w:tcPr/>
+          <w:p>
+            <w:pPr>
+              <w:pStyle w:val="Compact"/>
+            </w:pPr>
+            <w:r>
+              <w:t xml:space="preserve">the briefing day</w:t>
+            </w:r>
+          </w:p>
+        </w:tc>
+      </w:tr>
+      <w:tr>
+        <w:tc>
+          <w:tcPr/>
+          <w:p>
+            <w:pPr>
+              <w:pStyle w:val="Compact"/>
+            </w:pPr>
+            <w:r>
+              <w:rPr>
+                <w:rStyle w:val="VerbatimChar"/>
+              </w:rPr>
+              <w:t xml:space="preserve">headline</w:t>
             </w:r>
           </w:p>
         </w:tc>
@@ -2248,21 +2112,373 @@
             <w:pPr>
               <w:pStyle w:val="Compact"/>
             </w:pPr>
-            <w:r>
-              <w:rPr>
-                <w:rStyle w:val="VerbatimChar"/>
-              </w:rPr>
-              <w:t xml:space="preserve">briefing</w:t>
-            </w:r>
-            <w:r>
-              <w:t xml:space="preserve"> </w:t>
+          </w:p>
+        </w:tc>
+      </w:tr>
+      <w:tr>
+        <w:tc>
+          <w:tcPr/>
+          <w:p>
+            <w:pPr>
+              <w:pStyle w:val="Compact"/>
+            </w:pPr>
+            <w:r>
+              <w:rPr>
+                <w:rStyle w:val="VerbatimChar"/>
+              </w:rPr>
+              <w:t xml:space="preserve">overall_sentiment</w:t>
+            </w:r>
+          </w:p>
+        </w:tc>
+        <w:tc>
+          <w:tcPr/>
+          <w:p>
+            <w:pPr>
+              <w:pStyle w:val="Compact"/>
+            </w:pPr>
+            <w:r>
+              <w:t xml:space="preserve">text</w:t>
+            </w:r>
+          </w:p>
+        </w:tc>
+        <w:tc>
+          <w:tcPr/>
+          <w:p>
+            <w:pPr>
+              <w:pStyle w:val="Compact"/>
+            </w:pPr>
+            <w:r>
+              <w:rPr>
+                <w:rStyle w:val="VerbatimChar"/>
+              </w:rPr>
+              <w:t xml:space="preserve">bullish</w:t>
             </w:r>
             <w:r>
               <w:t xml:space="preserve">/</w:t>
             </w:r>
             <w:r>
-              <w:t xml:space="preserve"> </w:t>
-            </w:r>
+              <w:rPr>
+                <w:rStyle w:val="VerbatimChar"/>
+              </w:rPr>
+              <w:t xml:space="preserve">neutral</w:t>
+            </w:r>
+            <w:r>
+              <w:t xml:space="preserve">/</w:t>
+            </w:r>
+            <w:r>
+              <w:rPr>
+                <w:rStyle w:val="VerbatimChar"/>
+              </w:rPr>
+              <w:t xml:space="preserve">bearish</w:t>
+            </w:r>
+          </w:p>
+        </w:tc>
+      </w:tr>
+      <w:tr>
+        <w:tc>
+          <w:tcPr/>
+          <w:p>
+            <w:pPr>
+              <w:pStyle w:val="Compact"/>
+            </w:pPr>
+            <w:r>
+              <w:rPr>
+                <w:rStyle w:val="VerbatimChar"/>
+              </w:rPr>
+              <w:t xml:space="preserve">beginner_md</w:t>
+            </w:r>
+          </w:p>
+        </w:tc>
+        <w:tc>
+          <w:tcPr/>
+          <w:p>
+            <w:pPr>
+              <w:pStyle w:val="Compact"/>
+            </w:pPr>
+            <w:r>
+              <w:t xml:space="preserve">text</w:t>
+            </w:r>
+          </w:p>
+        </w:tc>
+        <w:tc>
+          <w:tcPr/>
+          <w:p>
+            <w:pPr>
+              <w:pStyle w:val="Compact"/>
+            </w:pPr>
+          </w:p>
+        </w:tc>
+      </w:tr>
+      <w:tr>
+        <w:tc>
+          <w:tcPr/>
+          <w:p>
+            <w:pPr>
+              <w:pStyle w:val="Compact"/>
+            </w:pPr>
+            <w:r>
+              <w:rPr>
+                <w:rStyle w:val="VerbatimChar"/>
+              </w:rPr>
+              <w:t xml:space="preserve">pro_md</w:t>
+            </w:r>
+          </w:p>
+        </w:tc>
+        <w:tc>
+          <w:tcPr/>
+          <w:p>
+            <w:pPr>
+              <w:pStyle w:val="Compact"/>
+            </w:pPr>
+            <w:r>
+              <w:t xml:space="preserve">text</w:t>
+            </w:r>
+          </w:p>
+        </w:tc>
+        <w:tc>
+          <w:tcPr/>
+          <w:p>
+            <w:pPr>
+              <w:pStyle w:val="Compact"/>
+            </w:pPr>
+          </w:p>
+        </w:tc>
+      </w:tr>
+      <w:tr>
+        <w:tc>
+          <w:tcPr/>
+          <w:p>
+            <w:pPr>
+              <w:pStyle w:val="Compact"/>
+            </w:pPr>
+            <w:r>
+              <w:rPr>
+                <w:rStyle w:val="VerbatimChar"/>
+              </w:rPr>
+              <w:t xml:space="preserve">story_ids</w:t>
+            </w:r>
+          </w:p>
+        </w:tc>
+        <w:tc>
+          <w:tcPr/>
+          <w:p>
+            <w:pPr>
+              <w:pStyle w:val="Compact"/>
+            </w:pPr>
+            <w:r>
+              <w:t xml:space="preserve">uuid[]</w:t>
+            </w:r>
+          </w:p>
+        </w:tc>
+        <w:tc>
+          <w:tcPr/>
+          <w:p>
+            <w:pPr>
+              <w:pStyle w:val="Compact"/>
+            </w:pPr>
+            <w:r>
+              <w:t xml:space="preserve">the stories featured</w:t>
+            </w:r>
+          </w:p>
+        </w:tc>
+      </w:tr>
+      <w:tr>
+        <w:tc>
+          <w:tcPr/>
+          <w:p>
+            <w:pPr>
+              <w:pStyle w:val="Compact"/>
+            </w:pPr>
+            <w:r>
+              <w:rPr>
+                <w:rStyle w:val="VerbatimChar"/>
+              </w:rPr>
+              <w:t xml:space="preserve">status</w:t>
+            </w:r>
+          </w:p>
+        </w:tc>
+        <w:tc>
+          <w:tcPr/>
+          <w:p>
+            <w:pPr>
+              <w:pStyle w:val="Compact"/>
+            </w:pPr>
+            <w:r>
+              <w:t xml:space="preserve">text</w:t>
+            </w:r>
+          </w:p>
+        </w:tc>
+        <w:tc>
+          <w:tcPr/>
+          <w:p>
+            <w:pPr>
+              <w:pStyle w:val="Compact"/>
+            </w:pPr>
+            <w:r>
+              <w:rPr>
+                <w:rStyle w:val="VerbatimChar"/>
+              </w:rPr>
+              <w:t xml:space="preserve">draft</w:t>
+            </w:r>
+            <w:r>
+              <w:t xml:space="preserve">/</w:t>
+            </w:r>
+            <w:r>
+              <w:rPr>
+                <w:rStyle w:val="VerbatimChar"/>
+              </w:rPr>
+              <w:t xml:space="preserve">published</w:t>
+            </w:r>
+          </w:p>
+        </w:tc>
+      </w:tr>
+      <w:tr>
+        <w:tc>
+          <w:tcPr/>
+          <w:p>
+            <w:pPr>
+              <w:pStyle w:val="Compact"/>
+            </w:pPr>
+            <w:r>
+              <w:rPr>
+                <w:rStyle w:val="VerbatimChar"/>
+              </w:rPr>
+              <w:t xml:space="preserve">created_at</w:t>
+            </w:r>
+          </w:p>
+        </w:tc>
+        <w:tc>
+          <w:tcPr/>
+          <w:p>
+            <w:pPr>
+              <w:pStyle w:val="Compact"/>
+            </w:pPr>
+            <w:r>
+              <w:t xml:space="preserve">timestamptz default now</w:t>
+            </w:r>
+          </w:p>
+        </w:tc>
+        <w:tc>
+          <w:tcPr/>
+          <w:p>
+            <w:pPr>
+              <w:pStyle w:val="Compact"/>
+            </w:pPr>
+          </w:p>
+        </w:tc>
+      </w:tr>
+    </w:tbl>
+    <w:bookmarkEnd w:id="13"/>
+    <w:bookmarkStart w:id="14" w:name="X24f77eea2447713c6a87b0714246bd0915ac071"/>
+    <w:p>
+      <w:pPr>
+        <w:pStyle w:val="Heading3"/>
+      </w:pPr>
+      <w:r>
+        <w:rPr>
+          <w:rStyle w:val="VerbatimChar"/>
+        </w:rPr>
+        <w:t xml:space="preserve">questions</w:t>
+      </w:r>
+      <w:r>
+        <w:t xml:space="preserve"> </w:t>
+      </w:r>
+      <w:r>
+        <w:t xml:space="preserve">— on-demand analysis (the poller’s queue)</w:t>
+      </w:r>
+    </w:p>
+    <w:tbl>
+      <w:tblPr>
+        <w:tblStyle w:val="Table"/>
+        <w:tblW w:type="pct" w:w="5000"/>
+        <w:tblLayout w:type="fixed"/>
+        <w:tblLook w:firstRow="1" w:lastRow="0" w:firstColumn="0" w:lastColumn="0" w:noHBand="0" w:noVBand="0" w:val="0020"/>
+      </w:tblPr>
+      <w:tblGrid>
+        <w:gridCol w:w="3017"/>
+        <w:gridCol w:w="2262"/>
+        <w:gridCol w:w="2640"/>
+      </w:tblGrid>
+      <w:tr>
+        <w:trPr>
+          <w:tblHeader w:val="on"/>
+        </w:trPr>
+        <w:tc>
+          <w:tcPr/>
+          <w:p>
+            <w:pPr>
+              <w:pStyle w:val="Compact"/>
+            </w:pPr>
+            <w:r>
+              <w:t xml:space="preserve">Column</w:t>
+            </w:r>
+          </w:p>
+        </w:tc>
+        <w:tc>
+          <w:tcPr/>
+          <w:p>
+            <w:pPr>
+              <w:pStyle w:val="Compact"/>
+            </w:pPr>
+            <w:r>
+              <w:t xml:space="preserve">Type</w:t>
+            </w:r>
+          </w:p>
+        </w:tc>
+        <w:tc>
+          <w:tcPr/>
+          <w:p>
+            <w:pPr>
+              <w:pStyle w:val="Compact"/>
+            </w:pPr>
+            <w:r>
+              <w:t xml:space="preserve">Notes</w:t>
+            </w:r>
+          </w:p>
+        </w:tc>
+      </w:tr>
+      <w:tr>
+        <w:tc>
+          <w:tcPr/>
+          <w:p>
+            <w:pPr>
+              <w:pStyle w:val="Compact"/>
+            </w:pPr>
+            <w:r>
+              <w:rPr>
+                <w:rStyle w:val="VerbatimChar"/>
+              </w:rPr>
+              <w:t xml:space="preserve">id</w:t>
+            </w:r>
+          </w:p>
+        </w:tc>
+        <w:tc>
+          <w:tcPr/>
+          <w:p>
+            <w:pPr>
+              <w:pStyle w:val="Compact"/>
+            </w:pPr>
+            <w:r>
+              <w:t xml:space="preserve">uuid PK</w:t>
+            </w:r>
+          </w:p>
+        </w:tc>
+        <w:tc>
+          <w:tcPr/>
+          <w:p>
+            <w:pPr>
+              <w:pStyle w:val="Compact"/>
+            </w:pPr>
+          </w:p>
+        </w:tc>
+      </w:tr>
+      <w:tr>
+        <w:tc>
+          <w:tcPr/>
+          <w:p>
+            <w:pPr>
+              <w:pStyle w:val="Compact"/>
+            </w:pPr>
             <w:r>
               <w:rPr>
                 <w:rStyle w:val="VerbatimChar"/>
@@ -2271,57 +2487,109 @@
             </w:r>
           </w:p>
         </w:tc>
-      </w:tr>
-      <w:tr>
-        <w:tc>
-          <w:tcPr/>
-          <w:p>
-            <w:pPr>
-              <w:pStyle w:val="Compact"/>
-            </w:pPr>
-            <w:r>
-              <w:rPr>
-                <w:rStyle w:val="VerbatimChar"/>
-              </w:rPr>
-              <w:t xml:space="preserve">ref_id</w:t>
-            </w:r>
-          </w:p>
-        </w:tc>
-        <w:tc>
-          <w:tcPr/>
-          <w:p>
-            <w:pPr>
-              <w:pStyle w:val="Compact"/>
-            </w:pPr>
-            <w:r>
-              <w:t xml:space="preserve">uuid</w:t>
-            </w:r>
-          </w:p>
-        </w:tc>
-        <w:tc>
-          <w:tcPr/>
-          <w:p>
-            <w:pPr>
-              <w:pStyle w:val="Compact"/>
-            </w:pPr>
-            <w:r>
-              <w:t xml:space="preserve">the briefing/question it belongs to</w:t>
-            </w:r>
-          </w:p>
-        </w:tc>
-      </w:tr>
-      <w:tr>
-        <w:tc>
-          <w:tcPr/>
-          <w:p>
-            <w:pPr>
-              <w:pStyle w:val="Compact"/>
-            </w:pPr>
-            <w:r>
-              <w:rPr>
-                <w:rStyle w:val="VerbatimChar"/>
-              </w:rPr>
-              <w:t xml:space="preserve">phoenix_trace_url</w:t>
+        <w:tc>
+          <w:tcPr/>
+          <w:p>
+            <w:pPr>
+              <w:pStyle w:val="Compact"/>
+            </w:pPr>
+            <w:r>
+              <w:t xml:space="preserve">text</w:t>
+            </w:r>
+          </w:p>
+        </w:tc>
+        <w:tc>
+          <w:tcPr/>
+          <w:p>
+            <w:pPr>
+              <w:pStyle w:val="Compact"/>
+            </w:pPr>
+            <w:r>
+              <w:t xml:space="preserve">user input (length-capped, sanitized)</w:t>
+            </w:r>
+          </w:p>
+        </w:tc>
+      </w:tr>
+      <w:tr>
+        <w:tc>
+          <w:tcPr/>
+          <w:p>
+            <w:pPr>
+              <w:pStyle w:val="Compact"/>
+            </w:pPr>
+            <w:r>
+              <w:rPr>
+                <w:rStyle w:val="VerbatimChar"/>
+              </w:rPr>
+              <w:t xml:space="preserve">status</w:t>
+            </w:r>
+          </w:p>
+        </w:tc>
+        <w:tc>
+          <w:tcPr/>
+          <w:p>
+            <w:pPr>
+              <w:pStyle w:val="Compact"/>
+            </w:pPr>
+            <w:r>
+              <w:t xml:space="preserve">text</w:t>
+            </w:r>
+          </w:p>
+        </w:tc>
+        <w:tc>
+          <w:tcPr/>
+          <w:p>
+            <w:pPr>
+              <w:pStyle w:val="Compact"/>
+            </w:pPr>
+            <w:r>
+              <w:rPr>
+                <w:rStyle w:val="VerbatimChar"/>
+              </w:rPr>
+              <w:t xml:space="preserve">pending</w:t>
+            </w:r>
+            <w:r>
+              <w:t xml:space="preserve">→</w:t>
+            </w:r>
+            <w:r>
+              <w:rPr>
+                <w:rStyle w:val="VerbatimChar"/>
+              </w:rPr>
+              <w:t xml:space="preserve">processing</w:t>
+            </w:r>
+            <w:r>
+              <w:t xml:space="preserve">→</w:t>
+            </w:r>
+            <w:r>
+              <w:rPr>
+                <w:rStyle w:val="VerbatimChar"/>
+              </w:rPr>
+              <w:t xml:space="preserve">done</w:t>
+            </w:r>
+            <w:r>
+              <w:t xml:space="preserve">→</w:t>
+            </w:r>
+            <w:r>
+              <w:rPr>
+                <w:rStyle w:val="VerbatimChar"/>
+              </w:rPr>
+              <w:t xml:space="preserve">error</w:t>
+            </w:r>
+          </w:p>
+        </w:tc>
+      </w:tr>
+      <w:tr>
+        <w:tc>
+          <w:tcPr/>
+          <w:p>
+            <w:pPr>
+              <w:pStyle w:val="Compact"/>
+            </w:pPr>
+            <w:r>
+              <w:rPr>
+                <w:rStyle w:val="VerbatimChar"/>
+              </w:rPr>
+              <w:t xml:space="preserve">beginner_md</w:t>
             </w:r>
           </w:p>
         </w:tc>
@@ -2342,82 +2610,155 @@
             <w:pPr>
               <w:pStyle w:val="Compact"/>
             </w:pPr>
-            <w:r>
-              <w:t xml:space="preserve">link to the trace</w:t>
-            </w:r>
-          </w:p>
-        </w:tc>
-      </w:tr>
-      <w:tr>
-        <w:tc>
-          <w:tcPr/>
-          <w:p>
-            <w:pPr>
-              <w:pStyle w:val="Compact"/>
-            </w:pPr>
-            <w:r>
-              <w:rPr>
-                <w:rStyle w:val="VerbatimChar"/>
-              </w:rPr>
-              <w:t xml:space="preserve">tokens</w:t>
-            </w:r>
-          </w:p>
-        </w:tc>
-        <w:tc>
-          <w:tcPr/>
-          <w:p>
-            <w:pPr>
-              <w:pStyle w:val="Compact"/>
-            </w:pPr>
-            <w:r>
-              <w:t xml:space="preserve">int null</w:t>
-            </w:r>
-          </w:p>
-        </w:tc>
-        <w:tc>
-          <w:tcPr/>
-          <w:p>
-            <w:pPr>
-              <w:pStyle w:val="Compact"/>
-            </w:pPr>
-            <w:r>
-              <w:t xml:space="preserve">for cost/usage tracking</w:t>
-            </w:r>
-          </w:p>
-        </w:tc>
-      </w:tr>
-      <w:tr>
-        <w:tc>
-          <w:tcPr/>
-          <w:p>
-            <w:pPr>
-              <w:pStyle w:val="Compact"/>
-            </w:pPr>
-            <w:r>
-              <w:rPr>
-                <w:rStyle w:val="VerbatimChar"/>
-              </w:rPr>
-              <w:t xml:space="preserve">duration_ms</w:t>
-            </w:r>
-          </w:p>
-        </w:tc>
-        <w:tc>
-          <w:tcPr/>
-          <w:p>
-            <w:pPr>
-              <w:pStyle w:val="Compact"/>
-            </w:pPr>
-            <w:r>
-              <w:t xml:space="preserve">int null</w:t>
-            </w:r>
-          </w:p>
-        </w:tc>
-        <w:tc>
-          <w:tcPr/>
-          <w:p>
-            <w:pPr>
-              <w:pStyle w:val="Compact"/>
-            </w:pPr>
+          </w:p>
+        </w:tc>
+      </w:tr>
+      <w:tr>
+        <w:tc>
+          <w:tcPr/>
+          <w:p>
+            <w:pPr>
+              <w:pStyle w:val="Compact"/>
+            </w:pPr>
+            <w:r>
+              <w:rPr>
+                <w:rStyle w:val="VerbatimChar"/>
+              </w:rPr>
+              <w:t xml:space="preserve">pro_md</w:t>
+            </w:r>
+          </w:p>
+        </w:tc>
+        <w:tc>
+          <w:tcPr/>
+          <w:p>
+            <w:pPr>
+              <w:pStyle w:val="Compact"/>
+            </w:pPr>
+            <w:r>
+              <w:t xml:space="preserve">text null</w:t>
+            </w:r>
+          </w:p>
+        </w:tc>
+        <w:tc>
+          <w:tcPr/>
+          <w:p>
+            <w:pPr>
+              <w:pStyle w:val="Compact"/>
+            </w:pPr>
+          </w:p>
+        </w:tc>
+      </w:tr>
+      <w:tr>
+        <w:tc>
+          <w:tcPr/>
+          <w:p>
+            <w:pPr>
+              <w:pStyle w:val="Compact"/>
+            </w:pPr>
+            <w:r>
+              <w:rPr>
+                <w:rStyle w:val="VerbatimChar"/>
+              </w:rPr>
+              <w:t xml:space="preserve">story_id</w:t>
+            </w:r>
+          </w:p>
+        </w:tc>
+        <w:tc>
+          <w:tcPr/>
+          <w:p>
+            <w:pPr>
+              <w:pStyle w:val="Compact"/>
+            </w:pPr>
+            <w:r>
+              <w:t xml:space="preserve">uuid null FK</w:t>
+            </w:r>
+          </w:p>
+        </w:tc>
+        <w:tc>
+          <w:tcPr/>
+          <w:p>
+            <w:pPr>
+              <w:pStyle w:val="Compact"/>
+            </w:pPr>
+            <w:r>
+              <w:t xml:space="preserve">the cluster built for this question</w:t>
+            </w:r>
+          </w:p>
+        </w:tc>
+      </w:tr>
+      <w:tr>
+        <w:tc>
+          <w:tcPr/>
+          <w:p>
+            <w:pPr>
+              <w:pStyle w:val="Compact"/>
+            </w:pPr>
+            <w:r>
+              <w:rPr>
+                <w:rStyle w:val="VerbatimChar"/>
+              </w:rPr>
+              <w:t xml:space="preserve">error</w:t>
+            </w:r>
+          </w:p>
+        </w:tc>
+        <w:tc>
+          <w:tcPr/>
+          <w:p>
+            <w:pPr>
+              <w:pStyle w:val="Compact"/>
+            </w:pPr>
+            <w:r>
+              <w:t xml:space="preserve">text null</w:t>
+            </w:r>
+          </w:p>
+        </w:tc>
+        <w:tc>
+          <w:tcPr/>
+          <w:p>
+            <w:pPr>
+              <w:pStyle w:val="Compact"/>
+            </w:pPr>
+            <w:r>
+              <w:t xml:space="preserve">populated on failure</w:t>
+            </w:r>
+          </w:p>
+        </w:tc>
+      </w:tr>
+      <w:tr>
+        <w:tc>
+          <w:tcPr/>
+          <w:p>
+            <w:pPr>
+              <w:pStyle w:val="Compact"/>
+            </w:pPr>
+            <w:r>
+              <w:rPr>
+                <w:rStyle w:val="VerbatimChar"/>
+              </w:rPr>
+              <w:t xml:space="preserve">client_hash</w:t>
+            </w:r>
+          </w:p>
+        </w:tc>
+        <w:tc>
+          <w:tcPr/>
+          <w:p>
+            <w:pPr>
+              <w:pStyle w:val="Compact"/>
+            </w:pPr>
+            <w:r>
+              <w:t xml:space="preserve">text null</w:t>
+            </w:r>
+          </w:p>
+        </w:tc>
+        <w:tc>
+          <w:tcPr/>
+          <w:p>
+            <w:pPr>
+              <w:pStyle w:val="Compact"/>
+            </w:pPr>
+            <w:r>
+              <w:t xml:space="preserve">salted hash of IP for rate limiting (not the IP)</w:t>
+            </w:r>
           </w:p>
         </w:tc>
       </w:tr>
@@ -2444,6 +2785,41 @@
             </w:pPr>
             <w:r>
               <w:t xml:space="preserve">timestamptz default now</w:t>
+            </w:r>
+          </w:p>
+        </w:tc>
+        <w:tc>
+          <w:tcPr/>
+          <w:p>
+            <w:pPr>
+              <w:pStyle w:val="Compact"/>
+            </w:pPr>
+          </w:p>
+        </w:tc>
+      </w:tr>
+      <w:tr>
+        <w:tc>
+          <w:tcPr/>
+          <w:p>
+            <w:pPr>
+              <w:pStyle w:val="Compact"/>
+            </w:pPr>
+            <w:r>
+              <w:rPr>
+                <w:rStyle w:val="VerbatimChar"/>
+              </w:rPr>
+              <w:t xml:space="preserve">processed_at</w:t>
+            </w:r>
+          </w:p>
+        </w:tc>
+        <w:tc>
+          <w:tcPr/>
+          <w:p>
+            <w:pPr>
+              <w:pStyle w:val="Compact"/>
+            </w:pPr>
+            <w:r>
+              <w:t xml:space="preserve">timestamptz null</w:t>
             </w:r>
           </w:p>
         </w:tc>
@@ -2458,8 +2834,356 @@
       </w:tr>
     </w:tbl>
     <w:bookmarkEnd w:id="14"/>
+    <w:bookmarkStart w:id="15" w:name="agent_runs-optional-developer-view"/>
+    <w:p>
+      <w:pPr>
+        <w:pStyle w:val="Heading3"/>
+      </w:pPr>
+      <w:r>
+        <w:rPr>
+          <w:rStyle w:val="VerbatimChar"/>
+        </w:rPr>
+        <w:t xml:space="preserve">agent_runs</w:t>
+      </w:r>
+      <w:r>
+        <w:t xml:space="preserve"> </w:t>
+      </w:r>
+      <w:r>
+        <w:rPr>
+          <w:i/>
+          <w:iCs/>
+        </w:rPr>
+        <w:t xml:space="preserve">(optional, developer view)</w:t>
+      </w:r>
+    </w:p>
+    <w:tbl>
+      <w:tblPr>
+        <w:tblStyle w:val="Table"/>
+        <w:tblW w:type="auto" w:w="0"/>
+        <w:tblLook w:firstRow="1" w:lastRow="0" w:firstColumn="0" w:lastColumn="0" w:noHBand="0" w:noVBand="0" w:val="0020"/>
+      </w:tblPr>
+      <w:tblGrid>
+        <w:gridCol w:w="2640"/>
+        <w:gridCol w:w="2640"/>
+        <w:gridCol w:w="2640"/>
+      </w:tblGrid>
+      <w:tr>
+        <w:trPr>
+          <w:tblHeader w:val="on"/>
+        </w:trPr>
+        <w:tc>
+          <w:tcPr/>
+          <w:p>
+            <w:pPr>
+              <w:pStyle w:val="Compact"/>
+            </w:pPr>
+            <w:r>
+              <w:t xml:space="preserve">Column</w:t>
+            </w:r>
+          </w:p>
+        </w:tc>
+        <w:tc>
+          <w:tcPr/>
+          <w:p>
+            <w:pPr>
+              <w:pStyle w:val="Compact"/>
+            </w:pPr>
+            <w:r>
+              <w:t xml:space="preserve">Type</w:t>
+            </w:r>
+          </w:p>
+        </w:tc>
+        <w:tc>
+          <w:tcPr/>
+          <w:p>
+            <w:pPr>
+              <w:pStyle w:val="Compact"/>
+            </w:pPr>
+            <w:r>
+              <w:t xml:space="preserve">Notes</w:t>
+            </w:r>
+          </w:p>
+        </w:tc>
+      </w:tr>
+      <w:tr>
+        <w:tc>
+          <w:tcPr/>
+          <w:p>
+            <w:pPr>
+              <w:pStyle w:val="Compact"/>
+            </w:pPr>
+            <w:r>
+              <w:rPr>
+                <w:rStyle w:val="VerbatimChar"/>
+              </w:rPr>
+              <w:t xml:space="preserve">id</w:t>
+            </w:r>
+          </w:p>
+        </w:tc>
+        <w:tc>
+          <w:tcPr/>
+          <w:p>
+            <w:pPr>
+              <w:pStyle w:val="Compact"/>
+            </w:pPr>
+            <w:r>
+              <w:t xml:space="preserve">uuid PK</w:t>
+            </w:r>
+          </w:p>
+        </w:tc>
+        <w:tc>
+          <w:tcPr/>
+          <w:p>
+            <w:pPr>
+              <w:pStyle w:val="Compact"/>
+            </w:pPr>
+          </w:p>
+        </w:tc>
+      </w:tr>
+      <w:tr>
+        <w:tc>
+          <w:tcPr/>
+          <w:p>
+            <w:pPr>
+              <w:pStyle w:val="Compact"/>
+            </w:pPr>
+            <w:r>
+              <w:rPr>
+                <w:rStyle w:val="VerbatimChar"/>
+              </w:rPr>
+              <w:t xml:space="preserve">kind</w:t>
+            </w:r>
+          </w:p>
+        </w:tc>
+        <w:tc>
+          <w:tcPr/>
+          <w:p>
+            <w:pPr>
+              <w:pStyle w:val="Compact"/>
+            </w:pPr>
+            <w:r>
+              <w:t xml:space="preserve">text</w:t>
+            </w:r>
+          </w:p>
+        </w:tc>
+        <w:tc>
+          <w:tcPr/>
+          <w:p>
+            <w:pPr>
+              <w:pStyle w:val="Compact"/>
+            </w:pPr>
+            <w:r>
+              <w:rPr>
+                <w:rStyle w:val="VerbatimChar"/>
+              </w:rPr>
+              <w:t xml:space="preserve">briefing</w:t>
+            </w:r>
+            <w:r>
+              <w:t xml:space="preserve"> </w:t>
+            </w:r>
+            <w:r>
+              <w:t xml:space="preserve">/</w:t>
+            </w:r>
+            <w:r>
+              <w:t xml:space="preserve"> </w:t>
+            </w:r>
+            <w:r>
+              <w:rPr>
+                <w:rStyle w:val="VerbatimChar"/>
+              </w:rPr>
+              <w:t xml:space="preserve">question</w:t>
+            </w:r>
+          </w:p>
+        </w:tc>
+      </w:tr>
+      <w:tr>
+        <w:tc>
+          <w:tcPr/>
+          <w:p>
+            <w:pPr>
+              <w:pStyle w:val="Compact"/>
+            </w:pPr>
+            <w:r>
+              <w:rPr>
+                <w:rStyle w:val="VerbatimChar"/>
+              </w:rPr>
+              <w:t xml:space="preserve">ref_id</w:t>
+            </w:r>
+          </w:p>
+        </w:tc>
+        <w:tc>
+          <w:tcPr/>
+          <w:p>
+            <w:pPr>
+              <w:pStyle w:val="Compact"/>
+            </w:pPr>
+            <w:r>
+              <w:t xml:space="preserve">uuid</w:t>
+            </w:r>
+          </w:p>
+        </w:tc>
+        <w:tc>
+          <w:tcPr/>
+          <w:p>
+            <w:pPr>
+              <w:pStyle w:val="Compact"/>
+            </w:pPr>
+            <w:r>
+              <w:t xml:space="preserve">the briefing/question it belongs to</w:t>
+            </w:r>
+          </w:p>
+        </w:tc>
+      </w:tr>
+      <w:tr>
+        <w:tc>
+          <w:tcPr/>
+          <w:p>
+            <w:pPr>
+              <w:pStyle w:val="Compact"/>
+            </w:pPr>
+            <w:r>
+              <w:rPr>
+                <w:rStyle w:val="VerbatimChar"/>
+              </w:rPr>
+              <w:t xml:space="preserve">phoenix_trace_url</w:t>
+            </w:r>
+          </w:p>
+        </w:tc>
+        <w:tc>
+          <w:tcPr/>
+          <w:p>
+            <w:pPr>
+              <w:pStyle w:val="Compact"/>
+            </w:pPr>
+            <w:r>
+              <w:t xml:space="preserve">text null</w:t>
+            </w:r>
+          </w:p>
+        </w:tc>
+        <w:tc>
+          <w:tcPr/>
+          <w:p>
+            <w:pPr>
+              <w:pStyle w:val="Compact"/>
+            </w:pPr>
+            <w:r>
+              <w:t xml:space="preserve">link to the trace</w:t>
+            </w:r>
+          </w:p>
+        </w:tc>
+      </w:tr>
+      <w:tr>
+        <w:tc>
+          <w:tcPr/>
+          <w:p>
+            <w:pPr>
+              <w:pStyle w:val="Compact"/>
+            </w:pPr>
+            <w:r>
+              <w:rPr>
+                <w:rStyle w:val="VerbatimChar"/>
+              </w:rPr>
+              <w:t xml:space="preserve">tokens</w:t>
+            </w:r>
+          </w:p>
+        </w:tc>
+        <w:tc>
+          <w:tcPr/>
+          <w:p>
+            <w:pPr>
+              <w:pStyle w:val="Compact"/>
+            </w:pPr>
+            <w:r>
+              <w:t xml:space="preserve">int null</w:t>
+            </w:r>
+          </w:p>
+        </w:tc>
+        <w:tc>
+          <w:tcPr/>
+          <w:p>
+            <w:pPr>
+              <w:pStyle w:val="Compact"/>
+            </w:pPr>
+            <w:r>
+              <w:t xml:space="preserve">for cost/usage tracking</w:t>
+            </w:r>
+          </w:p>
+        </w:tc>
+      </w:tr>
+      <w:tr>
+        <w:tc>
+          <w:tcPr/>
+          <w:p>
+            <w:pPr>
+              <w:pStyle w:val="Compact"/>
+            </w:pPr>
+            <w:r>
+              <w:rPr>
+                <w:rStyle w:val="VerbatimChar"/>
+              </w:rPr>
+              <w:t xml:space="preserve">duration_ms</w:t>
+            </w:r>
+          </w:p>
+        </w:tc>
+        <w:tc>
+          <w:tcPr/>
+          <w:p>
+            <w:pPr>
+              <w:pStyle w:val="Compact"/>
+            </w:pPr>
+            <w:r>
+              <w:t xml:space="preserve">int null</w:t>
+            </w:r>
+          </w:p>
+        </w:tc>
+        <w:tc>
+          <w:tcPr/>
+          <w:p>
+            <w:pPr>
+              <w:pStyle w:val="Compact"/>
+            </w:pPr>
+          </w:p>
+        </w:tc>
+      </w:tr>
+      <w:tr>
+        <w:tc>
+          <w:tcPr/>
+          <w:p>
+            <w:pPr>
+              <w:pStyle w:val="Compact"/>
+            </w:pPr>
+            <w:r>
+              <w:rPr>
+                <w:rStyle w:val="VerbatimChar"/>
+              </w:rPr>
+              <w:t xml:space="preserve">created_at</w:t>
+            </w:r>
+          </w:p>
+        </w:tc>
+        <w:tc>
+          <w:tcPr/>
+          <w:p>
+            <w:pPr>
+              <w:pStyle w:val="Compact"/>
+            </w:pPr>
+            <w:r>
+              <w:t xml:space="preserve">timestamptz default now</w:t>
+            </w:r>
+          </w:p>
+        </w:tc>
+        <w:tc>
+          <w:tcPr/>
+          <w:p>
+            <w:pPr>
+              <w:pStyle w:val="Compact"/>
+            </w:pPr>
+          </w:p>
+        </w:tc>
+      </w:tr>
+    </w:tbl>
     <w:bookmarkEnd w:id="15"/>
-    <w:bookmarkStart w:id="16" w:name="status-lifecycles"/>
+    <w:bookmarkEnd w:id="16"/>
+    <w:bookmarkStart w:id="17" w:name="status-lifecycles"/>
     <w:p>
       <w:pPr>
         <w:pStyle w:val="Heading2"/>
@@ -2607,8 +3331,8 @@
         <w:t xml:space="preserve">) so two runners never grab the same question.</w:t>
       </w:r>
     </w:p>
-    <w:bookmarkEnd w:id="16"/>
-    <w:bookmarkStart w:id="17" w:name="pgvector-decision"/>
+    <w:bookmarkEnd w:id="17"/>
+    <w:bookmarkStart w:id="18" w:name="pgvector-decision"/>
     <w:p>
       <w:pPr>
         <w:pStyle w:val="Heading2"/>
@@ -2773,8 +3497,8 @@
         <w:t xml:space="preserve">D-004.</w:t>
       </w:r>
     </w:p>
-    <w:bookmarkEnd w:id="17"/>
-    <w:bookmarkStart w:id="18" w:name="indexes-planned"/>
+    <w:bookmarkEnd w:id="18"/>
+    <w:bookmarkStart w:id="19" w:name="indexes-planned"/>
     <w:p>
       <w:pPr>
         <w:pStyle w:val="Heading2"/>
@@ -2927,8 +3651,8 @@
         <w:t xml:space="preserve">is used.</w:t>
       </w:r>
     </w:p>
-    <w:bookmarkEnd w:id="18"/>
     <w:bookmarkEnd w:id="19"/>
+    <w:bookmarkEnd w:id="20"/>
     <w:sectPr>
       <w:footnotePr>
         <w:numRestart w:val="eachSect"/>

</xml_diff>